<commit_message>
Compute TVaR as the expected shortfall over the worst years
TVaR was the mean of the simulated annual losses at or above the VaR. A
layer's annual loss has point masses (years at exactly 0, or at exactly
the full limit), and when the VaR lands on one, that mean takes in the
whole point mass, averaging far more than the worst (1 - q) of years.
With 100,000 simulated years on the example data, a 50 xs 50 layer
showed a TVaR of 53.1 against 69.8 for the worst 1% of years, and a
layer hit in under 1% of years collapses to the expected loss.

TVaR is now the expected shortfall: the mean of the largest
ceil((1 - q) * n) simulated annual losses. Premiums are unchanged, since
neither premium method uses TVaR. Tests cover the zero and full limit
point masses, and the documentation explains the definition.

Co-Authored-By: Claude Opus 5.5 <noreply@anthropic.com>
Claude-Session: https://claude.ai/code/session_01QbM5Aq37MynnLg55bZ4xFN
</commit_message>
<xml_diff>
--- a/Technical documentation.docx
+++ b/Technical documentation.docx
@@ -7,7 +7,19 @@
         <w:pStyle w:val="Title"/>
       </w:pPr>
       <w:r>
-        <w:t xml:space="preserve">Paco’s Pricing Pipeline</w:t>
+        <w:t xml:space="preserve">Paco’s</w:t>
+      </w:r>
+      <w:r>
+        <w:t xml:space="preserve"> </w:t>
+      </w:r>
+      <w:r>
+        <w:t xml:space="preserve">Pricing</w:t>
+      </w:r>
+      <w:r>
+        <w:t xml:space="preserve"> </w:t>
+      </w:r>
+      <w:r>
+        <w:t xml:space="preserve">Pipeline</w:t>
       </w:r>
     </w:p>
     <w:p>
@@ -15,7 +27,25 @@
         <w:pStyle w:val="Subtitle"/>
       </w:pPr>
       <w:r>
-        <w:t xml:space="preserve">Technical and Actuarial Documentation</w:t>
+        <w:t xml:space="preserve">Technical</w:t>
+      </w:r>
+      <w:r>
+        <w:t xml:space="preserve"> </w:t>
+      </w:r>
+      <w:r>
+        <w:t xml:space="preserve">and</w:t>
+      </w:r>
+      <w:r>
+        <w:t xml:space="preserve"> </w:t>
+      </w:r>
+      <w:r>
+        <w:t xml:space="preserve">Actuarial</w:t>
+      </w:r>
+      <w:r>
+        <w:t xml:space="preserve"> </w:t>
+      </w:r>
+      <w:r>
+        <w:t xml:space="preserve">Documentation</w:t>
       </w:r>
     </w:p>
     <w:p>
@@ -23,7 +53,19 @@
         <w:pStyle w:val="Author"/>
       </w:pPr>
       <w:r>
-        <w:t xml:space="preserve">Francisco Martinez Checa</w:t>
+        <w:t xml:space="preserve">Francisco</w:t>
+      </w:r>
+      <w:r>
+        <w:t xml:space="preserve"> </w:t>
+      </w:r>
+      <w:r>
+        <w:t xml:space="preserve">Martinez</w:t>
+      </w:r>
+      <w:r>
+        <w:t xml:space="preserve"> </w:t>
+      </w:r>
+      <w:r>
+        <w:t xml:space="preserve">Checa</w:t>
       </w:r>
     </w:p>
     <w:p>
@@ -31,7 +73,13 @@
         <w:pStyle w:val="Date"/>
       </w:pPr>
       <w:r>
-        <w:t xml:space="preserve">June 2026</w:t>
+        <w:t xml:space="preserve">June</w:t>
+      </w:r>
+      <w:r>
+        <w:t xml:space="preserve"> </w:t>
+      </w:r>
+      <w:r>
+        <w:t xml:space="preserve">2026</w:t>
       </w:r>
     </w:p>
     <w:bookmarkStart w:id="20" w:name="introduction"/>
@@ -87,22 +135,22 @@
       </w:r>
       <w:r>
         <w:rPr>
+          <w:iCs/>
           <w:i/>
+        </w:rPr>
+        <w:t xml:space="preserve">Reinsurance</w:t>
+      </w:r>
+      <w:r>
+        <w:rPr>
           <w:iCs/>
-        </w:rPr>
-        <w:t xml:space="preserve">Reinsurance</w:t>
-      </w:r>
-      <w:r>
-        <w:rPr>
           <w:i/>
+        </w:rPr>
+        <w:t xml:space="preserve"> </w:t>
+      </w:r>
+      <w:r>
+        <w:rPr>
           <w:iCs/>
-        </w:rPr>
-        <w:t xml:space="preserve"> </w:t>
-      </w:r>
-      <w:r>
-        <w:rPr>
           <w:i/>
-          <w:iCs/>
         </w:rPr>
         <w:t xml:space="preserve">Analytics, FS 2026</w:t>
       </w:r>
@@ -129,16 +177,16 @@
     </w:p>
     <w:p>
       <w:pPr>
-        <w:pStyle w:val="Compact"/>
         <w:numPr>
           <w:ilvl w:val="0"/>
           <w:numId w:val="1001"/>
         </w:numPr>
-      </w:pPr>
-      <w:r>
-        <w:rPr>
+        <w:pStyle w:val="Compact"/>
+      </w:pPr>
+      <w:r>
+        <w:rPr>
+          <w:bCs/>
           <w:b/>
-          <w:bCs/>
         </w:rPr>
         <w:t xml:space="preserve">Part 1, the technical guide</w:t>
       </w:r>
@@ -160,16 +208,16 @@
     </w:p>
     <w:p>
       <w:pPr>
-        <w:pStyle w:val="Compact"/>
         <w:numPr>
           <w:ilvl w:val="0"/>
           <w:numId w:val="1001"/>
         </w:numPr>
-      </w:pPr>
-      <w:r>
-        <w:rPr>
+        <w:pStyle w:val="Compact"/>
+      </w:pPr>
+      <w:r>
+        <w:rPr>
+          <w:bCs/>
           <w:b/>
-          <w:bCs/>
         </w:rPr>
         <w:t xml:space="preserve">Part 2, the actuarial methodology</w:t>
       </w:r>
@@ -231,16 +279,16 @@
     </w:p>
     <w:p>
       <w:pPr>
-        <w:pStyle w:val="Compact"/>
         <w:numPr>
           <w:ilvl w:val="0"/>
           <w:numId w:val="1002"/>
         </w:numPr>
-      </w:pPr>
-      <w:r>
-        <w:rPr>
+        <w:pStyle w:val="Compact"/>
+      </w:pPr>
+      <w:r>
+        <w:rPr>
+          <w:bCs/>
           <w:b/>
-          <w:bCs/>
         </w:rPr>
         <w:t xml:space="preserve">Pre-process.</w:t>
       </w:r>
@@ -271,16 +319,16 @@
     </w:p>
     <w:p>
       <w:pPr>
-        <w:pStyle w:val="Compact"/>
         <w:numPr>
           <w:ilvl w:val="0"/>
           <w:numId w:val="1002"/>
         </w:numPr>
-      </w:pPr>
-      <w:r>
-        <w:rPr>
+        <w:pStyle w:val="Compact"/>
+      </w:pPr>
+      <w:r>
+        <w:rPr>
+          <w:bCs/>
           <w:b/>
-          <w:bCs/>
         </w:rPr>
         <w:t xml:space="preserve">Fit.</w:t>
       </w:r>
@@ -299,16 +347,16 @@
     </w:p>
     <w:p>
       <w:pPr>
-        <w:pStyle w:val="Compact"/>
         <w:numPr>
           <w:ilvl w:val="0"/>
           <w:numId w:val="1002"/>
         </w:numPr>
-      </w:pPr>
-      <w:r>
-        <w:rPr>
+        <w:pStyle w:val="Compact"/>
+      </w:pPr>
+      <w:r>
+        <w:rPr>
+          <w:bCs/>
           <w:b/>
-          <w:bCs/>
         </w:rPr>
         <w:t xml:space="preserve">Simulate.</w:t>
       </w:r>
@@ -333,16 +381,16 @@
     </w:p>
     <w:p>
       <w:pPr>
-        <w:pStyle w:val="Compact"/>
         <w:numPr>
           <w:ilvl w:val="0"/>
           <w:numId w:val="1002"/>
         </w:numPr>
-      </w:pPr>
-      <w:r>
-        <w:rPr>
+        <w:pStyle w:val="Compact"/>
+      </w:pPr>
+      <w:r>
+        <w:rPr>
+          <w:bCs/>
           <w:b/>
-          <w:bCs/>
         </w:rPr>
         <w:t xml:space="preserve">Price.</w:t>
       </w:r>
@@ -392,7 +440,13 @@
         <w:t xml:space="preserve"> </w:t>
       </w:r>
       <w:r>
-        <w:t xml:space="preserve">“More information”</w:t>
+        <w:t xml:space="preserve">“</w:t>
+      </w:r>
+      <w:r>
+        <w:t xml:space="preserve">More information</w:t>
+      </w:r>
+      <w:r>
+        <w:t xml:space="preserve">”</w:t>
       </w:r>
       <w:r>
         <w:t xml:space="preserve"> </w:t>
@@ -405,8 +459,8 @@
       <w:tblPr>
         <w:tblStyle w:val="Table"/>
         <w:tblW w:type="pct" w:w="5000"/>
-        <w:tblLayout w:type="fixed"/>
         <w:tblLook w:firstRow="1" w:lastRow="0" w:firstColumn="0" w:lastColumn="0" w:noHBand="0" w:noVBand="0" w:val="0020"/>
+        <w:jc w:val="start"/>
       </w:tblPr>
       <w:tblGrid>
         <w:gridCol w:w="1900"/>
@@ -415,13 +469,14 @@
       </w:tblGrid>
       <w:tr>
         <w:trPr>
-          <w:tblHeader w:val="on"/>
+          <w:tblHeader w:val="true"/>
         </w:trPr>
         <w:tc>
           <w:tcPr/>
           <w:p>
             <w:pPr>
               <w:pStyle w:val="Compact"/>
+              <w:jc w:val="left"/>
             </w:pPr>
             <w:r>
               <w:t xml:space="preserve">Step</w:t>
@@ -433,6 +488,7 @@
           <w:p>
             <w:pPr>
               <w:pStyle w:val="Compact"/>
+              <w:jc w:val="left"/>
             </w:pPr>
             <w:r>
               <w:t xml:space="preserve">Name</w:t>
@@ -444,6 +500,7 @@
           <w:p>
             <w:pPr>
               <w:pStyle w:val="Compact"/>
+              <w:jc w:val="left"/>
             </w:pPr>
             <w:r>
               <w:t xml:space="preserve">What you do</w:t>
@@ -457,6 +514,7 @@
           <w:p>
             <w:pPr>
               <w:pStyle w:val="Compact"/>
+              <w:jc w:val="left"/>
             </w:pPr>
             <w:r>
               <w:t xml:space="preserve">1</w:t>
@@ -468,6 +526,7 @@
           <w:p>
             <w:pPr>
               <w:pStyle w:val="Compact"/>
+              <w:jc w:val="left"/>
             </w:pPr>
             <w:r>
               <w:t xml:space="preserve">Data</w:t>
@@ -479,6 +538,7 @@
           <w:p>
             <w:pPr>
               <w:pStyle w:val="Compact"/>
+              <w:jc w:val="left"/>
             </w:pPr>
             <w:r>
               <w:t xml:space="preserve">Upload the workbook and review the general inputs, losses, exposure and inflation that loaded.</w:t>
@@ -492,6 +552,7 @@
           <w:p>
             <w:pPr>
               <w:pStyle w:val="Compact"/>
+              <w:jc w:val="left"/>
             </w:pPr>
             <w:r>
               <w:t xml:space="preserve">2</w:t>
@@ -503,6 +564,7 @@
           <w:p>
             <w:pPr>
               <w:pStyle w:val="Compact"/>
+              <w:jc w:val="left"/>
             </w:pPr>
             <w:r>
               <w:t xml:space="preserve">Reinsurance structure</w:t>
@@ -514,6 +576,7 @@
           <w:p>
             <w:pPr>
               <w:pStyle w:val="Compact"/>
+              <w:jc w:val="left"/>
             </w:pPr>
             <w:r>
               <w:t xml:space="preserve">Define the reinsurance layers (deductible, cover, aggregate deductible, aggregate limit).</w:t>
@@ -527,6 +590,7 @@
           <w:p>
             <w:pPr>
               <w:pStyle w:val="Compact"/>
+              <w:jc w:val="left"/>
             </w:pPr>
             <w:r>
               <w:t xml:space="preserve">3</w:t>
@@ -538,6 +602,7 @@
           <w:p>
             <w:pPr>
               <w:pStyle w:val="Compact"/>
+              <w:jc w:val="left"/>
             </w:pPr>
             <w:r>
               <w:t xml:space="preserve">Model</w:t>
@@ -549,6 +614,7 @@
           <w:p>
             <w:pPr>
               <w:pStyle w:val="Compact"/>
+              <w:jc w:val="left"/>
             </w:pPr>
             <w:r>
               <w:t xml:space="preserve">Choose the modelling threshold, the splice threshold and the frequency model, while live plots show the fit.</w:t>
@@ -562,6 +628,7 @@
           <w:p>
             <w:pPr>
               <w:pStyle w:val="Compact"/>
+              <w:jc w:val="left"/>
             </w:pPr>
             <w:r>
               <w:t xml:space="preserve">4</w:t>
@@ -573,6 +640,7 @@
           <w:p>
             <w:pPr>
               <w:pStyle w:val="Compact"/>
+              <w:jc w:val="left"/>
             </w:pPr>
             <w:r>
               <w:t xml:space="preserve">Price</w:t>
@@ -584,6 +652,7 @@
           <w:p>
             <w:pPr>
               <w:pStyle w:val="Compact"/>
+              <w:jc w:val="left"/>
             </w:pPr>
             <w:r>
               <w:t xml:space="preserve">Set the loadings and the simulation size, run the pricing, and read the results and validation.</w:t>
@@ -618,16 +687,16 @@
     </w:p>
     <w:p>
       <w:pPr>
-        <w:pStyle w:val="Compact"/>
         <w:numPr>
           <w:ilvl w:val="0"/>
           <w:numId w:val="1003"/>
         </w:numPr>
-      </w:pPr>
-      <w:r>
-        <w:rPr>
+        <w:pStyle w:val="Compact"/>
+      </w:pPr>
+      <w:r>
+        <w:rPr>
+          <w:bCs/>
           <w:b/>
-          <w:bCs/>
         </w:rPr>
         <w:t xml:space="preserve">Operating system.</w:t>
       </w:r>
@@ -646,16 +715,16 @@
     </w:p>
     <w:p>
       <w:pPr>
-        <w:pStyle w:val="Compact"/>
         <w:numPr>
           <w:ilvl w:val="0"/>
           <w:numId w:val="1003"/>
         </w:numPr>
-      </w:pPr>
-      <w:r>
-        <w:rPr>
+        <w:pStyle w:val="Compact"/>
+      </w:pPr>
+      <w:r>
+        <w:rPr>
+          <w:bCs/>
           <w:b/>
-          <w:bCs/>
         </w:rPr>
         <w:t xml:space="preserve">R.</w:t>
       </w:r>
@@ -674,16 +743,16 @@
     </w:p>
     <w:p>
       <w:pPr>
-        <w:pStyle w:val="Compact"/>
         <w:numPr>
           <w:ilvl w:val="0"/>
           <w:numId w:val="1003"/>
         </w:numPr>
-      </w:pPr>
-      <w:r>
-        <w:rPr>
+        <w:pStyle w:val="Compact"/>
+      </w:pPr>
+      <w:r>
+        <w:rPr>
+          <w:bCs/>
           <w:b/>
-          <w:bCs/>
         </w:rPr>
         <w:t xml:space="preserve">R packages.</w:t>
       </w:r>
@@ -792,16 +861,16 @@
     </w:p>
     <w:p>
       <w:pPr>
-        <w:pStyle w:val="Compact"/>
         <w:numPr>
           <w:ilvl w:val="0"/>
           <w:numId w:val="1003"/>
         </w:numPr>
-      </w:pPr>
-      <w:r>
-        <w:rPr>
+        <w:pStyle w:val="Compact"/>
+      </w:pPr>
+      <w:r>
+        <w:rPr>
+          <w:bCs/>
           <w:b/>
-          <w:bCs/>
         </w:rPr>
         <w:t xml:space="preserve">Internet access (first run only).</w:t>
       </w:r>
@@ -841,16 +910,16 @@
     </w:p>
     <w:p>
       <w:pPr>
-        <w:pStyle w:val="Compact"/>
         <w:numPr>
           <w:ilvl w:val="0"/>
           <w:numId w:val="1003"/>
         </w:numPr>
-      </w:pPr>
-      <w:r>
-        <w:rPr>
+        <w:pStyle w:val="Compact"/>
+      </w:pPr>
+      <w:r>
+        <w:rPr>
+          <w:bCs/>
           <w:b/>
-          <w:bCs/>
         </w:rPr>
         <w:t xml:space="preserve">Excel.</w:t>
       </w:r>
@@ -1106,8 +1175,8 @@
       <w:tblPr>
         <w:tblStyle w:val="Table"/>
         <w:tblW w:type="pct" w:w="5000"/>
-        <w:tblLayout w:type="fixed"/>
         <w:tblLook w:firstRow="1" w:lastRow="0" w:firstColumn="0" w:lastColumn="0" w:noHBand="0" w:noVBand="0" w:val="0020"/>
+        <w:jc w:val="start"/>
       </w:tblPr>
       <w:tblGrid>
         <w:gridCol w:w="2970"/>
@@ -1115,13 +1184,14 @@
       </w:tblGrid>
       <w:tr>
         <w:trPr>
-          <w:tblHeader w:val="on"/>
+          <w:tblHeader w:val="true"/>
         </w:trPr>
         <w:tc>
           <w:tcPr/>
           <w:p>
             <w:pPr>
               <w:pStyle w:val="Compact"/>
+              <w:jc w:val="left"/>
             </w:pPr>
             <w:r>
               <w:t xml:space="preserve">Path</w:t>
@@ -1133,6 +1203,7 @@
           <w:p>
             <w:pPr>
               <w:pStyle w:val="Compact"/>
+              <w:jc w:val="left"/>
             </w:pPr>
             <w:r>
               <w:t xml:space="preserve">Contents</w:t>
@@ -1146,6 +1217,7 @@
           <w:p>
             <w:pPr>
               <w:pStyle w:val="Compact"/>
+              <w:jc w:val="left"/>
             </w:pPr>
             <w:r>
               <w:rPr>
@@ -1160,6 +1232,7 @@
           <w:p>
             <w:pPr>
               <w:pStyle w:val="Compact"/>
+              <w:jc w:val="left"/>
             </w:pPr>
             <w:r>
               <w:t xml:space="preserve">Double-click launcher; runs with no console window.</w:t>
@@ -1173,6 +1246,7 @@
           <w:p>
             <w:pPr>
               <w:pStyle w:val="Compact"/>
+              <w:jc w:val="left"/>
             </w:pPr>
             <w:r>
               <w:rPr>
@@ -1187,6 +1261,7 @@
           <w:p>
             <w:pPr>
               <w:pStyle w:val="Compact"/>
+              <w:jc w:val="left"/>
             </w:pPr>
             <w:r>
               <w:t xml:space="preserve">Fallback launcher for when</w:t>
@@ -1215,6 +1290,7 @@
           <w:p>
             <w:pPr>
               <w:pStyle w:val="Compact"/>
+              <w:jc w:val="left"/>
             </w:pPr>
             <w:r>
               <w:rPr>
@@ -1229,6 +1305,7 @@
           <w:p>
             <w:pPr>
               <w:pStyle w:val="Compact"/>
+              <w:jc w:val="left"/>
             </w:pPr>
             <w:r>
               <w:t xml:space="preserve">The example input workbook (styled to match the dashboard).</w:t>
@@ -1242,6 +1319,7 @@
           <w:p>
             <w:pPr>
               <w:pStyle w:val="Compact"/>
+              <w:jc w:val="left"/>
             </w:pPr>
             <w:r>
               <w:rPr>
@@ -1256,6 +1334,7 @@
           <w:p>
             <w:pPr>
               <w:pStyle w:val="Compact"/>
+              <w:jc w:val="left"/>
             </w:pPr>
             <w:r>
               <w:t xml:space="preserve">Short orientation for the repository.</w:t>
@@ -1269,6 +1348,7 @@
           <w:p>
             <w:pPr>
               <w:pStyle w:val="Compact"/>
+              <w:jc w:val="left"/>
             </w:pPr>
             <w:r>
               <w:rPr>
@@ -1283,6 +1363,7 @@
           <w:p>
             <w:pPr>
               <w:pStyle w:val="Compact"/>
+              <w:jc w:val="left"/>
             </w:pPr>
             <w:r>
               <w:t xml:space="preserve">All the code and tests.</w:t>
@@ -1296,6 +1377,7 @@
           <w:p>
             <w:pPr>
               <w:pStyle w:val="Compact"/>
+              <w:jc w:val="left"/>
             </w:pPr>
             <w:r>
               <w:rPr>
@@ -1310,6 +1392,7 @@
           <w:p>
             <w:pPr>
               <w:pStyle w:val="Compact"/>
+              <w:jc w:val="left"/>
             </w:pPr>
             <w:r>
               <w:t xml:space="preserve">The Shiny dashboard (UI and server).</w:t>
@@ -1323,6 +1406,7 @@
           <w:p>
             <w:pPr>
               <w:pStyle w:val="Compact"/>
+              <w:jc w:val="left"/>
             </w:pPr>
             <w:r>
               <w:rPr>
@@ -1337,6 +1421,7 @@
           <w:p>
             <w:pPr>
               <w:pStyle w:val="Compact"/>
+              <w:jc w:val="left"/>
             </w:pPr>
             <w:r>
               <w:t xml:space="preserve">One module per responsibility (see the module map).</w:t>
@@ -1350,6 +1435,7 @@
           <w:p>
             <w:pPr>
               <w:pStyle w:val="Compact"/>
+              <w:jc w:val="left"/>
             </w:pPr>
             <w:r>
               <w:rPr>
@@ -1364,6 +1450,7 @@
           <w:p>
             <w:pPr>
               <w:pStyle w:val="Compact"/>
+              <w:jc w:val="left"/>
             </w:pPr>
             <w:r>
               <w:t xml:space="preserve">One test file per module.</w:t>
@@ -1377,6 +1464,7 @@
           <w:p>
             <w:pPr>
               <w:pStyle w:val="Compact"/>
+              <w:jc w:val="left"/>
             </w:pPr>
             <w:r>
               <w:rPr>
@@ -1391,6 +1479,7 @@
           <w:p>
             <w:pPr>
               <w:pStyle w:val="Compact"/>
+              <w:jc w:val="left"/>
             </w:pPr>
             <w:r>
               <w:t xml:space="preserve">Regenerates the styled</w:t>
@@ -1419,6 +1508,7 @@
           <w:p>
             <w:pPr>
               <w:pStyle w:val="Compact"/>
+              <w:jc w:val="left"/>
             </w:pPr>
             <w:r>
               <w:rPr>
@@ -1433,6 +1523,7 @@
           <w:p>
             <w:pPr>
               <w:pStyle w:val="Compact"/>
+              <w:jc w:val="left"/>
             </w:pPr>
             <w:r>
               <w:t xml:space="preserve">Installs and verifies the required packages.</w:t>
@@ -1446,6 +1537,7 @@
           <w:p>
             <w:pPr>
               <w:pStyle w:val="Compact"/>
+              <w:jc w:val="left"/>
             </w:pPr>
             <w:r>
               <w:rPr>
@@ -1460,6 +1552,7 @@
           <w:p>
             <w:pPr>
               <w:pStyle w:val="Compact"/>
+              <w:jc w:val="left"/>
             </w:pPr>
             <w:r>
               <w:t xml:space="preserve">This documentation (Markdown; a Word copy is at the repo root).</w:t>
@@ -1484,56 +1577,77 @@
       </w:pPr>
       <w:r>
         <w:rPr>
+          <w:bCs/>
           <w:b/>
+        </w:rPr>
+        <w:t xml:space="preserve">The everyday way is to just double-click</w:t>
+      </w:r>
+      <w:r>
+        <w:rPr>
           <w:bCs/>
-        </w:rPr>
-        <w:t xml:space="preserve">The everyday way is to just double-click</w:t>
-      </w:r>
-      <w:r>
-        <w:rPr>
           <w:b/>
+        </w:rPr>
+        <w:t xml:space="preserve"> </w:t>
+      </w:r>
+      <w:r>
+        <w:rPr>
+          <w:rStyle w:val="VerbatimChar"/>
           <w:bCs/>
-        </w:rPr>
+          <w:b/>
+        </w:rPr>
+        <w:t xml:space="preserve">start.vbs</w:t>
+      </w:r>
+      <w:r>
+        <w:rPr>
+          <w:bCs/>
+          <w:b/>
+        </w:rPr>
+        <w:t xml:space="preserve">.</w:t>
+      </w:r>
+      <w:r>
+        <w:t xml:space="preserve"> </w:t>
+      </w:r>
+      <w:r>
+        <w:t xml:space="preserve">That is all an end</w:t>
+      </w:r>
+      <w:r>
+        <w:t xml:space="preserve"> </w:t>
+      </w:r>
+      <w:r>
+        <w:t xml:space="preserve">user needs to do: it installs anything missing on the first run and opens the</w:t>
+      </w:r>
+      <w:r>
+        <w:t xml:space="preserve"> </w:t>
+      </w:r>
+      <w:r>
+        <w:t xml:space="preserve">dashboard in the browser (see Installation and first run above).</w:t>
+      </w:r>
+      <w:r>
+        <w:t xml:space="preserve"> </w:t>
+      </w:r>
+      <w:r>
+        <w:t xml:space="preserve">No commands and no R knowledge are required. If</w:t>
+      </w:r>
+      <w:r>
         <w:t xml:space="preserve"> </w:t>
       </w:r>
       <w:r>
         <w:rPr>
           <w:rStyle w:val="VerbatimChar"/>
-          <w:b/>
-          <w:bCs/>
-        </w:rPr>
-        <w:t xml:space="preserve">start.vbs</w:t>
-      </w:r>
-      <w:r>
-        <w:rPr>
-          <w:b/>
-          <w:bCs/>
-        </w:rPr>
-        <w:t xml:space="preserve">.</w:t>
-      </w:r>
-      <w:r>
-        <w:t xml:space="preserve"> </w:t>
-      </w:r>
-      <w:r>
-        <w:t xml:space="preserve">That is all an end</w:t>
-      </w:r>
-      <w:r>
-        <w:t xml:space="preserve"> </w:t>
-      </w:r>
-      <w:r>
-        <w:t xml:space="preserve">user needs to do: it installs anything missing on the first run and opens the</w:t>
-      </w:r>
-      <w:r>
-        <w:t xml:space="preserve"> </w:t>
-      </w:r>
-      <w:r>
-        <w:t xml:space="preserve">dashboard in the browser (see Installation and first run above).</w:t>
-      </w:r>
-      <w:r>
-        <w:t xml:space="preserve"> </w:t>
-      </w:r>
-      <w:r>
-        <w:t xml:space="preserve">No commands and no R knowledge are required. If</w:t>
+        </w:rPr>
+        <w:t xml:space="preserve">.vbs</w:t>
+      </w:r>
+      <w:r>
+        <w:t xml:space="preserve"> </w:t>
+      </w:r>
+      <w:r>
+        <w:t xml:space="preserve">files are blocked</w:t>
+      </w:r>
+      <w:r>
+        <w:t xml:space="preserve"> </w:t>
+      </w:r>
+      <w:r>
+        <w:t xml:space="preserve">on the machine, open</w:t>
       </w:r>
       <w:r>
         <w:t xml:space="preserve"> </w:t>
@@ -1542,19 +1656,45 @@
         <w:rPr>
           <w:rStyle w:val="VerbatimChar"/>
         </w:rPr>
-        <w:t xml:space="preserve">.vbs</w:t>
-      </w:r>
-      <w:r>
-        <w:t xml:space="preserve"> </w:t>
-      </w:r>
-      <w:r>
-        <w:t xml:space="preserve">files are blocked</w:t>
-      </w:r>
-      <w:r>
-        <w:t xml:space="preserve"> </w:t>
-      </w:r>
-      <w:r>
-        <w:t xml:space="preserve">on the machine, open</w:t>
+        <w:t xml:space="preserve">Start in RStudio.R</w:t>
+      </w:r>
+      <w:r>
+        <w:t xml:space="preserve"> </w:t>
+      </w:r>
+      <w:r>
+        <w:t xml:space="preserve">in RStudio and click Source instead;</w:t>
+      </w:r>
+      <w:r>
+        <w:t xml:space="preserve"> </w:t>
+      </w:r>
+      <w:r>
+        <w:t xml:space="preserve">it does the same job through R rather than a script file.</w:t>
+      </w:r>
+    </w:p>
+    <w:p>
+      <w:pPr>
+        <w:pStyle w:val="BodyText"/>
+      </w:pPr>
+      <w:r>
+        <w:t xml:space="preserve">The rest of this section is for developers and advanced use only, and needs</w:t>
+      </w:r>
+      <w:r>
+        <w:t xml:space="preserve"> </w:t>
+      </w:r>
+      <w:r>
+        <w:t xml:space="preserve">the full source repository, not the release zip, since the release zip only</w:t>
+      </w:r>
+      <w:r>
+        <w:t xml:space="preserve"> </w:t>
+      </w:r>
+      <w:r>
+        <w:t xml:space="preserve">ships what an end user needs to run the tool and leaves out the test suite</w:t>
+      </w:r>
+      <w:r>
+        <w:t xml:space="preserve"> </w:t>
+      </w:r>
+      <w:r>
+        <w:t xml:space="preserve">and other developer-only files. These commands all run from inside the</w:t>
       </w:r>
       <w:r>
         <w:t xml:space="preserve"> </w:t>
@@ -1563,53 +1703,6 @@
         <w:rPr>
           <w:rStyle w:val="VerbatimChar"/>
         </w:rPr>
-        <w:t xml:space="preserve">Start in RStudio.R</w:t>
-      </w:r>
-      <w:r>
-        <w:t xml:space="preserve"> </w:t>
-      </w:r>
-      <w:r>
-        <w:t xml:space="preserve">in RStudio and click Source instead;</w:t>
-      </w:r>
-      <w:r>
-        <w:t xml:space="preserve"> </w:t>
-      </w:r>
-      <w:r>
-        <w:t xml:space="preserve">it does the same job through R rather than a script file.</w:t>
-      </w:r>
-    </w:p>
-    <w:p>
-      <w:pPr>
-        <w:pStyle w:val="BodyText"/>
-      </w:pPr>
-      <w:r>
-        <w:t xml:space="preserve">The rest of this section is for developers and advanced use only, and needs</w:t>
-      </w:r>
-      <w:r>
-        <w:t xml:space="preserve"> </w:t>
-      </w:r>
-      <w:r>
-        <w:t xml:space="preserve">the full source repository, not the release zip, since the release zip only</w:t>
-      </w:r>
-      <w:r>
-        <w:t xml:space="preserve"> </w:t>
-      </w:r>
-      <w:r>
-        <w:t xml:space="preserve">ships what an end user needs to run the tool and leaves out the test suite</w:t>
-      </w:r>
-      <w:r>
-        <w:t xml:space="preserve"> </w:t>
-      </w:r>
-      <w:r>
-        <w:t xml:space="preserve">and other developer-only files. These commands all run from inside the</w:t>
-      </w:r>
-      <w:r>
-        <w:t xml:space="preserve"> </w:t>
-      </w:r>
-      <w:r>
-        <w:rPr>
-          <w:rStyle w:val="VerbatimChar"/>
-        </w:rPr>
         <w:t xml:space="preserve">engine/</w:t>
       </w:r>
       <w:r>
@@ -1621,16 +1714,16 @@
     </w:p>
     <w:p>
       <w:pPr>
-        <w:pStyle w:val="Compact"/>
         <w:numPr>
           <w:ilvl w:val="0"/>
           <w:numId w:val="1004"/>
         </w:numPr>
-      </w:pPr>
-      <w:r>
-        <w:rPr>
+        <w:pStyle w:val="Compact"/>
+      </w:pPr>
+      <w:r>
+        <w:rPr>
+          <w:bCs/>
           <w:b/>
-          <w:bCs/>
         </w:rPr>
         <w:t xml:space="preserve">Launch the dashboard:</w:t>
       </w:r>
@@ -1709,16 +1802,16 @@
     </w:p>
     <w:p>
       <w:pPr>
-        <w:pStyle w:val="Compact"/>
         <w:numPr>
           <w:ilvl w:val="0"/>
           <w:numId w:val="1004"/>
         </w:numPr>
-      </w:pPr>
-      <w:r>
-        <w:rPr>
+        <w:pStyle w:val="Compact"/>
+      </w:pPr>
+      <w:r>
+        <w:rPr>
+          <w:bCs/>
           <w:b/>
-          <w:bCs/>
         </w:rPr>
         <w:t xml:space="preserve">Run the test suite:</w:t>
       </w:r>
@@ -1776,16 +1869,16 @@
     </w:p>
     <w:p>
       <w:pPr>
-        <w:pStyle w:val="Compact"/>
         <w:numPr>
           <w:ilvl w:val="0"/>
           <w:numId w:val="1004"/>
         </w:numPr>
-      </w:pPr>
-      <w:r>
-        <w:rPr>
+        <w:pStyle w:val="Compact"/>
+      </w:pPr>
+      <w:r>
+        <w:rPr>
+          <w:bCs/>
           <w:b/>
-          <w:bCs/>
         </w:rPr>
         <w:t xml:space="preserve">Regenerate the example workbook:</w:t>
       </w:r>
@@ -1824,41 +1917,41 @@
       </w:r>
       <w:r>
         <w:rPr>
+          <w:bCs/>
           <w:b/>
+        </w:rPr>
+        <w:t xml:space="preserve">not</w:t>
+      </w:r>
+      <w:r>
+        <w:t xml:space="preserve"> </w:t>
+      </w:r>
+      <w:r>
+        <w:t xml:space="preserve">in the workbook; it is defined in the dashboard.</w:t>
+      </w:r>
+    </w:p>
+    <w:p>
+      <w:pPr>
+        <w:pStyle w:val="BodyText"/>
+      </w:pPr>
+      <w:r>
+        <w:rPr>
           <w:bCs/>
-        </w:rPr>
-        <w:t xml:space="preserve">not</w:t>
-      </w:r>
-      <w:r>
-        <w:t xml:space="preserve"> </w:t>
-      </w:r>
-      <w:r>
-        <w:t xml:space="preserve">in the workbook; it is defined in the dashboard.</w:t>
-      </w:r>
-    </w:p>
-    <w:p>
-      <w:pPr>
-        <w:pStyle w:val="BodyText"/>
-      </w:pPr>
-      <w:r>
-        <w:rPr>
           <w:b/>
+        </w:rPr>
+        <w:t xml:space="preserve">Sheet</w:t>
+      </w:r>
+      <w:r>
+        <w:rPr>
           <w:bCs/>
-        </w:rPr>
-        <w:t xml:space="preserve">Sheet</w:t>
-      </w:r>
-      <w:r>
-        <w:rPr>
           <w:b/>
+        </w:rPr>
+        <w:t xml:space="preserve"> </w:t>
+      </w:r>
+      <w:r>
+        <w:rPr>
+          <w:rStyle w:val="VerbatimChar"/>
           <w:bCs/>
-        </w:rPr>
-        <w:t xml:space="preserve"> </w:t>
-      </w:r>
-      <w:r>
-        <w:rPr>
-          <w:rStyle w:val="VerbatimChar"/>
           <w:b/>
-          <w:bCs/>
         </w:rPr>
         <w:t xml:space="preserve">general inputs</w:t>
       </w:r>
@@ -1894,8 +1987,8 @@
       <w:tblPr>
         <w:tblStyle w:val="Table"/>
         <w:tblW w:type="pct" w:w="5000"/>
-        <w:tblLayout w:type="fixed"/>
         <w:tblLook w:firstRow="1" w:lastRow="0" w:firstColumn="0" w:lastColumn="0" w:noHBand="0" w:noVBand="0" w:val="0020"/>
+        <w:jc w:val="start"/>
       </w:tblPr>
       <w:tblGrid>
         <w:gridCol w:w="1277"/>
@@ -1905,13 +1998,14 @@
       </w:tblGrid>
       <w:tr>
         <w:trPr>
-          <w:tblHeader w:val="on"/>
+          <w:tblHeader w:val="true"/>
         </w:trPr>
         <w:tc>
           <w:tcPr/>
           <w:p>
             <w:pPr>
               <w:pStyle w:val="Compact"/>
+              <w:jc w:val="left"/>
             </w:pPr>
             <w:r>
               <w:t xml:space="preserve">key</w:t>
@@ -1923,6 +2017,7 @@
           <w:p>
             <w:pPr>
               <w:pStyle w:val="Compact"/>
+              <w:jc w:val="left"/>
             </w:pPr>
             <w:r>
               <w:t xml:space="preserve">example</w:t>
@@ -1934,6 +2029,7 @@
           <w:p>
             <w:pPr>
               <w:pStyle w:val="Compact"/>
+              <w:jc w:val="left"/>
             </w:pPr>
             <w:r>
               <w:t xml:space="preserve">required</w:t>
@@ -1945,6 +2041,7 @@
           <w:p>
             <w:pPr>
               <w:pStyle w:val="Compact"/>
+              <w:jc w:val="left"/>
             </w:pPr>
             <w:r>
               <w:t xml:space="preserve">notes</w:t>
@@ -1958,6 +2055,7 @@
           <w:p>
             <w:pPr>
               <w:pStyle w:val="Compact"/>
+              <w:jc w:val="left"/>
             </w:pPr>
             <w:r>
               <w:rPr>
@@ -1972,6 +2070,7 @@
           <w:p>
             <w:pPr>
               <w:pStyle w:val="Compact"/>
+              <w:jc w:val="left"/>
             </w:pPr>
             <w:r>
               <w:t xml:space="preserve">2026</w:t>
@@ -1983,6 +2082,7 @@
           <w:p>
             <w:pPr>
               <w:pStyle w:val="Compact"/>
+              <w:jc w:val="left"/>
             </w:pPr>
             <w:r>
               <w:t xml:space="preserve">yes</w:t>
@@ -1994,6 +2094,7 @@
           <w:p>
             <w:pPr>
               <w:pStyle w:val="Compact"/>
+              <w:jc w:val="left"/>
             </w:pPr>
             <w:r>
               <w:t xml:space="preserve">the year all losses are revalued to</w:t>
@@ -2007,6 +2108,7 @@
           <w:p>
             <w:pPr>
               <w:pStyle w:val="Compact"/>
+              <w:jc w:val="left"/>
             </w:pPr>
             <w:r>
               <w:rPr>
@@ -2021,6 +2123,7 @@
           <w:p>
             <w:pPr>
               <w:pStyle w:val="Compact"/>
+              <w:jc w:val="left"/>
             </w:pPr>
             <w:r>
               <w:t xml:space="preserve">2</w:t>
@@ -2032,6 +2135,7 @@
           <w:p>
             <w:pPr>
               <w:pStyle w:val="Compact"/>
+              <w:jc w:val="left"/>
             </w:pPr>
             <w:r>
               <w:t xml:space="preserve">yes</w:t>
@@ -2043,6 +2147,7 @@
           <w:p>
             <w:pPr>
               <w:pStyle w:val="Compact"/>
+              <w:jc w:val="left"/>
             </w:pPr>
             <w:r>
               <w:t xml:space="preserve">the loss size above which the data is complete; indexed to the valuation year it bounds the modelling threshold from below</w:t>
@@ -2056,6 +2161,7 @@
           <w:p>
             <w:pPr>
               <w:pStyle w:val="Compact"/>
+              <w:jc w:val="left"/>
             </w:pPr>
             <w:r>
               <w:rPr>
@@ -2070,6 +2176,7 @@
           <w:p>
             <w:pPr>
               <w:pStyle w:val="Compact"/>
+              <w:jc w:val="left"/>
             </w:pPr>
             <w:r>
               <w:t xml:space="preserve">2025</w:t>
@@ -2081,6 +2188,7 @@
           <w:p>
             <w:pPr>
               <w:pStyle w:val="Compact"/>
+              <w:jc w:val="left"/>
             </w:pPr>
             <w:r>
               <w:t xml:space="preserve">no</w:t>
@@ -2092,6 +2200,7 @@
           <w:p>
             <w:pPr>
               <w:pStyle w:val="Compact"/>
+              <w:jc w:val="left"/>
             </w:pPr>
             <w:r>
               <w:t xml:space="preserve">the last year with complete loss data; it ends the frequency and burning cost window (defaults to the latest loss year)</w:t>
@@ -2105,6 +2214,7 @@
           <w:p>
             <w:pPr>
               <w:pStyle w:val="Compact"/>
+              <w:jc w:val="left"/>
             </w:pPr>
             <w:r>
               <w:rPr>
@@ -2119,6 +2229,7 @@
           <w:p>
             <w:pPr>
               <w:pStyle w:val="Compact"/>
+              <w:jc w:val="left"/>
             </w:pPr>
             <w:r>
               <w:t xml:space="preserve">EUR</w:t>
@@ -2130,6 +2241,7 @@
           <w:p>
             <w:pPr>
               <w:pStyle w:val="Compact"/>
+              <w:jc w:val="left"/>
             </w:pPr>
             <w:r>
               <w:t xml:space="preserve">no</w:t>
@@ -2141,6 +2253,7 @@
           <w:p>
             <w:pPr>
               <w:pStyle w:val="Compact"/>
+              <w:jc w:val="left"/>
             </w:pPr>
             <w:r>
               <w:t xml:space="preserve">labels every amount in the dashboard and the export</w:t>
@@ -2154,6 +2267,7 @@
           <w:p>
             <w:pPr>
               <w:pStyle w:val="Compact"/>
+              <w:jc w:val="left"/>
             </w:pPr>
             <w:r>
               <w:rPr>
@@ -2168,6 +2282,7 @@
           <w:p>
             <w:pPr>
               <w:pStyle w:val="Compact"/>
+              <w:jc w:val="left"/>
             </w:pPr>
             <w:r>
               <w:t xml:space="preserve">millions</w:t>
@@ -2179,6 +2294,7 @@
           <w:p>
             <w:pPr>
               <w:pStyle w:val="Compact"/>
+              <w:jc w:val="left"/>
             </w:pPr>
             <w:r>
               <w:t xml:space="preserve">no</w:t>
@@ -2190,6 +2306,7 @@
           <w:p>
             <w:pPr>
               <w:pStyle w:val="Compact"/>
+              <w:jc w:val="left"/>
             </w:pPr>
             <w:r>
               <w:t xml:space="preserve">labels the scale of the figures, e.g. millions</w:t>
@@ -2340,23 +2457,23 @@
       </w:pPr>
       <w:r>
         <w:rPr>
+          <w:bCs/>
           <w:b/>
+        </w:rPr>
+        <w:t xml:space="preserve">Sheet</w:t>
+      </w:r>
+      <w:r>
+        <w:rPr>
           <w:bCs/>
-        </w:rPr>
-        <w:t xml:space="preserve">Sheet</w:t>
-      </w:r>
-      <w:r>
-        <w:rPr>
           <w:b/>
+        </w:rPr>
+        <w:t xml:space="preserve"> </w:t>
+      </w:r>
+      <w:r>
+        <w:rPr>
+          <w:rStyle w:val="VerbatimChar"/>
           <w:bCs/>
-        </w:rPr>
-        <w:t xml:space="preserve"> </w:t>
-      </w:r>
-      <w:r>
-        <w:rPr>
-          <w:rStyle w:val="VerbatimChar"/>
           <w:b/>
-          <w:bCs/>
         </w:rPr>
         <w:t xml:space="preserve">losses</w:t>
       </w:r>
@@ -2372,6 +2489,7 @@
         <w:tblStyle w:val="Table"/>
         <w:tblW w:type="auto" w:w="0"/>
         <w:tblLook w:firstRow="1" w:lastRow="0" w:firstColumn="0" w:lastColumn="0" w:noHBand="0" w:noVBand="0" w:val="0020"/>
+        <w:jc w:val="start"/>
       </w:tblPr>
       <w:tblGrid>
         <w:gridCol w:w="2640"/>
@@ -2380,13 +2498,14 @@
       </w:tblGrid>
       <w:tr>
         <w:trPr>
-          <w:tblHeader w:val="on"/>
+          <w:tblHeader w:val="true"/>
         </w:trPr>
         <w:tc>
           <w:tcPr/>
           <w:p>
             <w:pPr>
               <w:pStyle w:val="Compact"/>
+              <w:jc w:val="left"/>
             </w:pPr>
             <w:r>
               <w:t xml:space="preserve">column</w:t>
@@ -2398,6 +2517,7 @@
           <w:p>
             <w:pPr>
               <w:pStyle w:val="Compact"/>
+              <w:jc w:val="left"/>
             </w:pPr>
             <w:r>
               <w:t xml:space="preserve">type</w:t>
@@ -2409,6 +2529,7 @@
           <w:p>
             <w:pPr>
               <w:pStyle w:val="Compact"/>
+              <w:jc w:val="left"/>
             </w:pPr>
             <w:r>
               <w:t xml:space="preserve">notes</w:t>
@@ -2422,6 +2543,7 @@
           <w:p>
             <w:pPr>
               <w:pStyle w:val="Compact"/>
+              <w:jc w:val="left"/>
             </w:pPr>
             <w:r>
               <w:rPr>
@@ -2436,6 +2558,7 @@
           <w:p>
             <w:pPr>
               <w:pStyle w:val="Compact"/>
+              <w:jc w:val="left"/>
             </w:pPr>
             <w:r>
               <w:t xml:space="preserve">integer</w:t>
@@ -2447,6 +2570,7 @@
           <w:p>
             <w:pPr>
               <w:pStyle w:val="Compact"/>
+              <w:jc w:val="left"/>
             </w:pPr>
             <w:r>
               <w:t xml:space="preserve">accident or occurrence year</w:t>
@@ -2460,6 +2584,7 @@
           <w:p>
             <w:pPr>
               <w:pStyle w:val="Compact"/>
+              <w:jc w:val="left"/>
             </w:pPr>
             <w:r>
               <w:rPr>
@@ -2474,6 +2599,7 @@
           <w:p>
             <w:pPr>
               <w:pStyle w:val="Compact"/>
+              <w:jc w:val="left"/>
             </w:pPr>
             <w:r>
               <w:t xml:space="preserve">numeric</w:t>
@@ -2485,6 +2611,7 @@
           <w:p>
             <w:pPr>
               <w:pStyle w:val="Compact"/>
+              <w:jc w:val="left"/>
             </w:pPr>
             <w:r>
               <w:t xml:space="preserve">ground-up loss amount</w:t>
@@ -2498,6 +2625,7 @@
           <w:p>
             <w:pPr>
               <w:pStyle w:val="Compact"/>
+              <w:jc w:val="left"/>
             </w:pPr>
             <w:r>
               <w:rPr>
@@ -2512,6 +2640,7 @@
           <w:p>
             <w:pPr>
               <w:pStyle w:val="Compact"/>
+              <w:jc w:val="left"/>
             </w:pPr>
             <w:r>
               <w:t xml:space="preserve">text</w:t>
@@ -2523,6 +2652,7 @@
           <w:p>
             <w:pPr>
               <w:pStyle w:val="Compact"/>
+              <w:jc w:val="left"/>
             </w:pPr>
             <w:r>
               <w:t xml:space="preserve">optional, informational</w:t>
@@ -2537,23 +2667,23 @@
       </w:pPr>
       <w:r>
         <w:rPr>
+          <w:bCs/>
           <w:b/>
+        </w:rPr>
+        <w:t xml:space="preserve">Sheet</w:t>
+      </w:r>
+      <w:r>
+        <w:rPr>
           <w:bCs/>
-        </w:rPr>
-        <w:t xml:space="preserve">Sheet</w:t>
-      </w:r>
-      <w:r>
-        <w:rPr>
           <w:b/>
+        </w:rPr>
+        <w:t xml:space="preserve"> </w:t>
+      </w:r>
+      <w:r>
+        <w:rPr>
+          <w:rStyle w:val="VerbatimChar"/>
           <w:bCs/>
-        </w:rPr>
-        <w:t xml:space="preserve"> </w:t>
-      </w:r>
-      <w:r>
-        <w:rPr>
-          <w:rStyle w:val="VerbatimChar"/>
           <w:b/>
-          <w:bCs/>
         </w:rPr>
         <w:t xml:space="preserve">exposure</w:t>
       </w:r>
@@ -2574,8 +2704,8 @@
       <w:tblPr>
         <w:tblStyle w:val="Table"/>
         <w:tblW w:type="pct" w:w="5000"/>
-        <w:tblLayout w:type="fixed"/>
         <w:tblLook w:firstRow="1" w:lastRow="0" w:firstColumn="0" w:lastColumn="0" w:noHBand="0" w:noVBand="0" w:val="0020"/>
+        <w:jc w:val="start"/>
       </w:tblPr>
       <w:tblGrid>
         <w:gridCol w:w="3017"/>
@@ -2584,13 +2714,14 @@
       </w:tblGrid>
       <w:tr>
         <w:trPr>
-          <w:tblHeader w:val="on"/>
+          <w:tblHeader w:val="true"/>
         </w:trPr>
         <w:tc>
           <w:tcPr/>
           <w:p>
             <w:pPr>
               <w:pStyle w:val="Compact"/>
+              <w:jc w:val="left"/>
             </w:pPr>
             <w:r>
               <w:t xml:space="preserve">column</w:t>
@@ -2602,6 +2733,7 @@
           <w:p>
             <w:pPr>
               <w:pStyle w:val="Compact"/>
+              <w:jc w:val="left"/>
             </w:pPr>
             <w:r>
               <w:t xml:space="preserve">type</w:t>
@@ -2613,6 +2745,7 @@
           <w:p>
             <w:pPr>
               <w:pStyle w:val="Compact"/>
+              <w:jc w:val="left"/>
             </w:pPr>
             <w:r>
               <w:t xml:space="preserve">notes</w:t>
@@ -2626,6 +2759,7 @@
           <w:p>
             <w:pPr>
               <w:pStyle w:val="Compact"/>
+              <w:jc w:val="left"/>
             </w:pPr>
             <w:r>
               <w:rPr>
@@ -2640,6 +2774,7 @@
           <w:p>
             <w:pPr>
               <w:pStyle w:val="Compact"/>
+              <w:jc w:val="left"/>
             </w:pPr>
             <w:r>
               <w:t xml:space="preserve">integer</w:t>
@@ -2661,6 +2796,7 @@
           <w:p>
             <w:pPr>
               <w:pStyle w:val="Compact"/>
+              <w:jc w:val="left"/>
             </w:pPr>
             <w:r>
               <w:rPr>
@@ -2675,6 +2811,7 @@
           <w:p>
             <w:pPr>
               <w:pStyle w:val="Compact"/>
+              <w:jc w:val="left"/>
             </w:pPr>
             <w:r>
               <w:t xml:space="preserve">numeric</w:t>
@@ -2686,6 +2823,7 @@
           <w:p>
             <w:pPr>
               <w:pStyle w:val="Compact"/>
+              <w:jc w:val="left"/>
             </w:pPr>
             <w:r>
               <w:t xml:space="preserve">exposure measure, for example number of risks or sum insured</w:t>
@@ -2700,23 +2838,23 @@
       </w:pPr>
       <w:r>
         <w:rPr>
+          <w:bCs/>
           <w:b/>
+        </w:rPr>
+        <w:t xml:space="preserve">Sheet</w:t>
+      </w:r>
+      <w:r>
+        <w:rPr>
           <w:bCs/>
-        </w:rPr>
-        <w:t xml:space="preserve">Sheet</w:t>
-      </w:r>
-      <w:r>
-        <w:rPr>
           <w:b/>
+        </w:rPr>
+        <w:t xml:space="preserve"> </w:t>
+      </w:r>
+      <w:r>
+        <w:rPr>
+          <w:rStyle w:val="VerbatimChar"/>
           <w:bCs/>
-        </w:rPr>
-        <w:t xml:space="preserve"> </w:t>
-      </w:r>
-      <w:r>
-        <w:rPr>
-          <w:rStyle w:val="VerbatimChar"/>
           <w:b/>
-          <w:bCs/>
         </w:rPr>
         <w:t xml:space="preserve">inflation</w:t>
       </w:r>
@@ -2737,8 +2875,8 @@
       <w:tblPr>
         <w:tblStyle w:val="Table"/>
         <w:tblW w:type="pct" w:w="5000"/>
-        <w:tblLayout w:type="fixed"/>
         <w:tblLook w:firstRow="1" w:lastRow="0" w:firstColumn="0" w:lastColumn="0" w:noHBand="0" w:noVBand="0" w:val="0020"/>
+        <w:jc w:val="start"/>
       </w:tblPr>
       <w:tblGrid>
         <w:gridCol w:w="3017"/>
@@ -2747,13 +2885,14 @@
       </w:tblGrid>
       <w:tr>
         <w:trPr>
-          <w:tblHeader w:val="on"/>
+          <w:tblHeader w:val="true"/>
         </w:trPr>
         <w:tc>
           <w:tcPr/>
           <w:p>
             <w:pPr>
               <w:pStyle w:val="Compact"/>
+              <w:jc w:val="left"/>
             </w:pPr>
             <w:r>
               <w:t xml:space="preserve">column</w:t>
@@ -2765,6 +2904,7 @@
           <w:p>
             <w:pPr>
               <w:pStyle w:val="Compact"/>
+              <w:jc w:val="left"/>
             </w:pPr>
             <w:r>
               <w:t xml:space="preserve">type</w:t>
@@ -2776,6 +2916,7 @@
           <w:p>
             <w:pPr>
               <w:pStyle w:val="Compact"/>
+              <w:jc w:val="left"/>
             </w:pPr>
             <w:r>
               <w:t xml:space="preserve">notes</w:t>
@@ -2789,6 +2930,7 @@
           <w:p>
             <w:pPr>
               <w:pStyle w:val="Compact"/>
+              <w:jc w:val="left"/>
             </w:pPr>
             <w:r>
               <w:rPr>
@@ -2803,6 +2945,7 @@
           <w:p>
             <w:pPr>
               <w:pStyle w:val="Compact"/>
+              <w:jc w:val="left"/>
             </w:pPr>
             <w:r>
               <w:t xml:space="preserve">integer</w:t>
@@ -2824,6 +2967,7 @@
           <w:p>
             <w:pPr>
               <w:pStyle w:val="Compact"/>
+              <w:jc w:val="left"/>
             </w:pPr>
             <w:r>
               <w:rPr>
@@ -2838,6 +2982,7 @@
           <w:p>
             <w:pPr>
               <w:pStyle w:val="Compact"/>
+              <w:jc w:val="left"/>
             </w:pPr>
             <w:r>
               <w:t xml:space="preserve">numeric</w:t>
@@ -2849,6 +2994,7 @@
           <w:p>
             <w:pPr>
               <w:pStyle w:val="Compact"/>
+              <w:jc w:val="left"/>
             </w:pPr>
             <w:r>
               <w:t xml:space="preserve">loss inflation during that year, for example 0.03 for 3%</w:t>
@@ -2910,17 +3056,17 @@
     </w:p>
     <w:p>
       <w:pPr>
-        <w:pStyle w:val="Compact"/>
         <w:numPr>
           <w:ilvl w:val="0"/>
           <w:numId w:val="1005"/>
         </w:numPr>
+        <w:pStyle w:val="Compact"/>
       </w:pPr>
       <w:r>
         <w:rPr>
           <w:rStyle w:val="VerbatimChar"/>
+          <w:bCs/>
           <w:b/>
-          <w:bCs/>
         </w:rPr>
         <w:t xml:space="preserve">results</w:t>
       </w:r>
@@ -2936,17 +3082,17 @@
     </w:p>
     <w:p>
       <w:pPr>
-        <w:pStyle w:val="Compact"/>
         <w:numPr>
           <w:ilvl w:val="0"/>
           <w:numId w:val="1005"/>
         </w:numPr>
+        <w:pStyle w:val="Compact"/>
       </w:pPr>
       <w:r>
         <w:rPr>
           <w:rStyle w:val="VerbatimChar"/>
+          <w:bCs/>
           <w:b/>
-          <w:bCs/>
         </w:rPr>
         <w:t xml:space="preserve">validation</w:t>
       </w:r>
@@ -2962,17 +3108,17 @@
     </w:p>
     <w:p>
       <w:pPr>
-        <w:pStyle w:val="Compact"/>
         <w:numPr>
           <w:ilvl w:val="0"/>
           <w:numId w:val="1005"/>
         </w:numPr>
+        <w:pStyle w:val="Compact"/>
       </w:pPr>
       <w:r>
         <w:rPr>
           <w:rStyle w:val="VerbatimChar"/>
+          <w:bCs/>
           <w:b/>
-          <w:bCs/>
         </w:rPr>
         <w:t xml:space="preserve">contract</w:t>
       </w:r>
@@ -2988,17 +3134,17 @@
     </w:p>
     <w:p>
       <w:pPr>
-        <w:pStyle w:val="Compact"/>
         <w:numPr>
           <w:ilvl w:val="0"/>
           <w:numId w:val="1005"/>
         </w:numPr>
+        <w:pStyle w:val="Compact"/>
       </w:pPr>
       <w:r>
         <w:rPr>
           <w:rStyle w:val="VerbatimChar"/>
+          <w:bCs/>
           <w:b/>
-          <w:bCs/>
         </w:rPr>
         <w:t xml:space="preserve">assumptions</w:t>
       </w:r>
@@ -3067,8 +3213,8 @@
       <w:tblPr>
         <w:tblStyle w:val="Table"/>
         <w:tblW w:type="pct" w:w="5000"/>
-        <w:tblLayout w:type="fixed"/>
         <w:tblLook w:firstRow="1" w:lastRow="0" w:firstColumn="0" w:lastColumn="0" w:noHBand="0" w:noVBand="0" w:val="0020"/>
+        <w:jc w:val="start"/>
       </w:tblPr>
       <w:tblGrid>
         <w:gridCol w:w="2640"/>
@@ -3076,13 +3222,14 @@
       </w:tblGrid>
       <w:tr>
         <w:trPr>
-          <w:tblHeader w:val="on"/>
+          <w:tblHeader w:val="true"/>
         </w:trPr>
         <w:tc>
           <w:tcPr/>
           <w:p>
             <w:pPr>
               <w:pStyle w:val="Compact"/>
+              <w:jc w:val="left"/>
             </w:pPr>
             <w:r>
               <w:t xml:space="preserve">module</w:t>
@@ -3094,6 +3241,7 @@
           <w:p>
             <w:pPr>
               <w:pStyle w:val="Compact"/>
+              <w:jc w:val="left"/>
             </w:pPr>
             <w:r>
               <w:t xml:space="preserve">responsibility</w:t>
@@ -3107,6 +3255,7 @@
           <w:p>
             <w:pPr>
               <w:pStyle w:val="Compact"/>
+              <w:jc w:val="left"/>
             </w:pPr>
             <w:r>
               <w:rPr>
@@ -3121,6 +3270,7 @@
           <w:p>
             <w:pPr>
               <w:pStyle w:val="Compact"/>
+              <w:jc w:val="left"/>
             </w:pPr>
             <w:r>
               <w:t xml:space="preserve">read the input workbook, write the output workbook</w:t>
@@ -3134,6 +3284,7 @@
           <w:p>
             <w:pPr>
               <w:pStyle w:val="Compact"/>
+              <w:jc w:val="left"/>
             </w:pPr>
             <w:r>
               <w:rPr>
@@ -3148,6 +3299,7 @@
           <w:p>
             <w:pPr>
               <w:pStyle w:val="Compact"/>
+              <w:jc w:val="left"/>
             </w:pPr>
             <w:r>
               <w:t xml:space="preserve">the per-loss layer function and the default program</w:t>
@@ -3161,6 +3313,7 @@
           <w:p>
             <w:pPr>
               <w:pStyle w:val="Compact"/>
+              <w:jc w:val="left"/>
             </w:pPr>
             <w:r>
               <w:rPr>
@@ -3175,6 +3328,7 @@
           <w:p>
             <w:pPr>
               <w:pStyle w:val="Compact"/>
+              <w:jc w:val="left"/>
             </w:pPr>
             <w:r>
               <w:t xml:space="preserve">inflation indexation, exposure scaling, burning cost</w:t>
@@ -3188,6 +3342,7 @@
           <w:p>
             <w:pPr>
               <w:pStyle w:val="Compact"/>
+              <w:jc w:val="left"/>
             </w:pPr>
             <w:r>
               <w:rPr>
@@ -3202,6 +3357,7 @@
           <w:p>
             <w:pPr>
               <w:pStyle w:val="Compact"/>
+              <w:jc w:val="left"/>
             </w:pPr>
             <w:r>
               <w:t xml:space="preserve">fit and scale Poisson, Negative Binomial or Binomial</w:t>
@@ -3215,6 +3371,7 @@
           <w:p>
             <w:pPr>
               <w:pStyle w:val="Compact"/>
+              <w:jc w:val="left"/>
             </w:pPr>
             <w:r>
               <w:rPr>
@@ -3229,6 +3386,7 @@
           <w:p>
             <w:pPr>
               <w:pStyle w:val="Compact"/>
+              <w:jc w:val="left"/>
             </w:pPr>
             <w:r>
               <w:t xml:space="preserve">fit the spliced lognormal and Pareto, survival, sampler</w:t>
@@ -3242,6 +3400,7 @@
           <w:p>
             <w:pPr>
               <w:pStyle w:val="Compact"/>
+              <w:jc w:val="left"/>
             </w:pPr>
             <w:r>
               <w:rPr>
@@ -3256,6 +3415,7 @@
           <w:p>
             <w:pPr>
               <w:pStyle w:val="Compact"/>
+              <w:jc w:val="left"/>
             </w:pPr>
             <w:r>
               <w:t xml:space="preserve">Monte Carlo of annual ground-up losses</w:t>
@@ -3269,6 +3429,7 @@
           <w:p>
             <w:pPr>
               <w:pStyle w:val="Compact"/>
+              <w:jc w:val="left"/>
             </w:pPr>
             <w:r>
               <w:rPr>
@@ -3283,6 +3444,7 @@
           <w:p>
             <w:pPr>
               <w:pStyle w:val="Compact"/>
+              <w:jc w:val="left"/>
             </w:pPr>
             <w:r>
               <w:t xml:space="preserve">apply the layers, compute premiums and risk metrics</w:t>
@@ -3296,6 +3458,7 @@
           <w:p>
             <w:pPr>
               <w:pStyle w:val="Compact"/>
+              <w:jc w:val="left"/>
             </w:pPr>
             <w:r>
               <w:rPr>
@@ -3310,6 +3473,7 @@
           <w:p>
             <w:pPr>
               <w:pStyle w:val="Compact"/>
+              <w:jc w:val="left"/>
             </w:pPr>
             <w:r>
               <w:t xml:space="preserve">closed-form and numerical-integration validation oracle</w:t>
@@ -3323,6 +3487,7 @@
           <w:p>
             <w:pPr>
               <w:pStyle w:val="Compact"/>
+              <w:jc w:val="left"/>
             </w:pPr>
             <w:r>
               <w:rPr>
@@ -3337,6 +3502,7 @@
           <w:p>
             <w:pPr>
               <w:pStyle w:val="Compact"/>
+              <w:jc w:val="left"/>
             </w:pPr>
             <w:r>
               <w:t xml:space="preserve">tie the modules together (</w:t>
@@ -3383,6 +3549,7 @@
           <w:p>
             <w:pPr>
               <w:pStyle w:val="Compact"/>
+              <w:jc w:val="left"/>
             </w:pPr>
             <w:r>
               <w:rPr>
@@ -3397,6 +3564,7 @@
           <w:p>
             <w:pPr>
               <w:pStyle w:val="Compact"/>
+              <w:jc w:val="left"/>
             </w:pPr>
             <w:r>
               <w:t xml:space="preserve">shared display formatters, so the dashboard tables and the Excel report match</w:t>
@@ -3410,6 +3578,7 @@
           <w:p>
             <w:pPr>
               <w:pStyle w:val="Compact"/>
+              <w:jc w:val="left"/>
             </w:pPr>
             <w:r>
               <w:rPr>
@@ -3424,6 +3593,7 @@
           <w:p>
             <w:pPr>
               <w:pStyle w:val="Compact"/>
+              <w:jc w:val="left"/>
             </w:pPr>
             <w:r>
               <w:t xml:space="preserve">build the styled</w:t>
@@ -3452,6 +3622,7 @@
           <w:p>
             <w:pPr>
               <w:pStyle w:val="Compact"/>
+              <w:jc w:val="left"/>
             </w:pPr>
             <w:r>
               <w:rPr>
@@ -3466,6 +3637,7 @@
           <w:p>
             <w:pPr>
               <w:pStyle w:val="Compact"/>
+              <w:jc w:val="left"/>
             </w:pPr>
             <w:r>
               <w:t xml:space="preserve">the Shiny dashboard</w:t>
@@ -3484,16 +3656,16 @@
     </w:p>
     <w:p>
       <w:pPr>
-        <w:pStyle w:val="Compact"/>
         <w:numPr>
           <w:ilvl w:val="0"/>
           <w:numId w:val="1006"/>
         </w:numPr>
-      </w:pPr>
-      <w:r>
-        <w:rPr>
+        <w:pStyle w:val="Compact"/>
+      </w:pPr>
+      <w:r>
+        <w:rPr>
+          <w:bCs/>
           <w:b/>
-          <w:bCs/>
         </w:rPr>
         <w:t xml:space="preserve">The fit is separated from the simulation.</w:t>
       </w:r>
@@ -3542,16 +3714,16 @@
     </w:p>
     <w:p>
       <w:pPr>
-        <w:pStyle w:val="Compact"/>
         <w:numPr>
           <w:ilvl w:val="0"/>
           <w:numId w:val="1006"/>
         </w:numPr>
-      </w:pPr>
-      <w:r>
-        <w:rPr>
+        <w:pStyle w:val="Compact"/>
+      </w:pPr>
+      <w:r>
+        <w:rPr>
+          <w:bCs/>
           <w:b/>
-          <w:bCs/>
         </w:rPr>
         <w:t xml:space="preserve">The dashboard owns the contract.</w:t>
       </w:r>
@@ -3728,8 +3900,8 @@
       </w:pPr>
       <w:r>
         <w:rPr>
+          <w:bCs/>
           <w:b/>
-          <w:bCs/>
         </w:rPr>
         <w:t xml:space="preserve">Loss inflation (indexation).</w:t>
       </w:r>
@@ -3750,8 +3922,8 @@
       </w:r>
       <w:r>
         <w:rPr>
+          <w:iCs/>
           <w:i/>
-          <w:iCs/>
         </w:rPr>
         <w:t xml:space="preserve">after</w:t>
       </w:r>
@@ -3842,8 +4014,8 @@
               <m:d>
                 <m:dPr>
                   <m:begChr m:val="("/>
+                  <m:endChr m:val=")"/>
                   <m:sepChr m:val=""/>
-                  <m:endChr m:val=")"/>
                   <m:grow/>
                 </m:dPr>
                 <m:e>
@@ -4085,8 +4257,8 @@
       </w:pPr>
       <w:r>
         <w:rPr>
+          <w:bCs/>
           <w:b/>
-          <w:bCs/>
         </w:rPr>
         <w:t xml:space="preserve">The reporting threshold must be indexed too.</w:t>
       </w:r>
@@ -4107,8 +4279,8 @@
       </w:r>
       <w:r>
         <w:rPr>
+          <w:iCs/>
           <w:i/>
-          <w:iCs/>
         </w:rPr>
         <w:t xml:space="preserve">own</w:t>
       </w:r>
@@ -4255,8 +4427,8 @@
       </w:pPr>
       <w:r>
         <w:rPr>
+          <w:bCs/>
           <w:b/>
-          <w:bCs/>
         </w:rPr>
         <w:t xml:space="preserve">Exposure drives frequency, not severity.</w:t>
       </w:r>
@@ -4473,8 +4645,8 @@
       </w:pPr>
       <w:r>
         <w:rPr>
+          <w:bCs/>
           <w:b/>
-          <w:bCs/>
         </w:rPr>
         <w:t xml:space="preserve">Burning cost on-levelling.</w:t>
       </w:r>
@@ -4557,8 +4729,8 @@
       </w:r>
       <w:r>
         <w:rPr>
+          <w:iCs/>
           <w:i/>
-          <w:iCs/>
         </w:rPr>
         <w:t xml:space="preserve">before</w:t>
       </w:r>
@@ -4621,22 +4793,22 @@
       </w:r>
       <w:r>
         <w:rPr>
+          <w:bCs/>
           <w:b/>
+        </w:rPr>
+        <w:t xml:space="preserve">above the</w:t>
+      </w:r>
+      <w:r>
+        <w:rPr>
           <w:bCs/>
-        </w:rPr>
-        <w:t xml:space="preserve">above the</w:t>
-      </w:r>
-      <w:r>
-        <w:rPr>
           <w:b/>
+        </w:rPr>
+        <w:t xml:space="preserve"> </w:t>
+      </w:r>
+      <w:r>
+        <w:rPr>
           <w:bCs/>
-        </w:rPr>
-        <w:t xml:space="preserve"> </w:t>
-      </w:r>
-      <w:r>
-        <w:rPr>
           <w:b/>
-          <w:bCs/>
         </w:rPr>
         <w:t xml:space="preserve">modelling threshold</w:t>
       </w:r>
@@ -4757,16 +4929,16 @@
     </w:p>
     <w:p>
       <w:pPr>
-        <w:pStyle w:val="Compact"/>
         <w:numPr>
           <w:ilvl w:val="0"/>
           <w:numId w:val="1007"/>
         </w:numPr>
-      </w:pPr>
-      <w:r>
-        <w:rPr>
+        <w:pStyle w:val="Compact"/>
+      </w:pPr>
+      <w:r>
+        <w:rPr>
+          <w:bCs/>
           <w:b/>
-          <w:bCs/>
         </w:rPr>
         <w:t xml:space="preserve">Poisson.</w:t>
       </w:r>
@@ -4800,16 +4972,16 @@
     </w:p>
     <w:p>
       <w:pPr>
-        <w:pStyle w:val="Compact"/>
         <w:numPr>
           <w:ilvl w:val="0"/>
           <w:numId w:val="1007"/>
         </w:numPr>
-      </w:pPr>
-      <w:r>
-        <w:rPr>
+        <w:pStyle w:val="Compact"/>
+      </w:pPr>
+      <w:r>
+        <w:rPr>
+          <w:bCs/>
           <w:b/>
-          <w:bCs/>
         </w:rPr>
         <w:t xml:space="preserve">Negative Binomial</w:t>
       </w:r>
@@ -4879,8 +5051,8 @@
         <m:d>
           <m:dPr>
             <m:begChr m:val="("/>
+            <m:endChr m:val=")"/>
             <m:sepChr m:val=""/>
-            <m:endChr m:val=")"/>
             <m:grow/>
           </m:dPr>
           <m:e>
@@ -4928,16 +5100,16 @@
     </w:p>
     <w:p>
       <w:pPr>
-        <w:pStyle w:val="Compact"/>
         <w:numPr>
           <w:ilvl w:val="0"/>
           <w:numId w:val="1007"/>
         </w:numPr>
-      </w:pPr>
-      <w:r>
-        <w:rPr>
+        <w:pStyle w:val="Compact"/>
+      </w:pPr>
+      <w:r>
+        <w:rPr>
+          <w:bCs/>
           <w:b/>
-          <w:bCs/>
         </w:rPr>
         <w:t xml:space="preserve">Binomial</w:t>
       </w:r>
@@ -5054,8 +5226,8 @@
         <m:d>
           <m:dPr>
             <m:begChr m:val="("/>
+            <m:endChr m:val=")"/>
             <m:sepChr m:val=""/>
-            <m:endChr m:val=")"/>
             <m:grow/>
           </m:dPr>
           <m:e>
@@ -5155,22 +5327,22 @@
       </w:r>
       <w:r>
         <w:rPr>
+          <w:bCs/>
           <w:b/>
+        </w:rPr>
+        <w:t xml:space="preserve">conditional on a loss exceeding the modelling</w:t>
+      </w:r>
+      <w:r>
+        <w:rPr>
           <w:bCs/>
-        </w:rPr>
-        <w:t xml:space="preserve">conditional on a loss exceeding the modelling</w:t>
-      </w:r>
-      <w:r>
-        <w:rPr>
           <w:b/>
+        </w:rPr>
+        <w:t xml:space="preserve"> </w:t>
+      </w:r>
+      <w:r>
+        <w:rPr>
           <w:bCs/>
-        </w:rPr>
-        <w:t xml:space="preserve"> </w:t>
-      </w:r>
-      <w:r>
-        <w:rPr>
           <w:b/>
-          <w:bCs/>
         </w:rPr>
         <w:t xml:space="preserve">threshold MT</w:t>
       </w:r>
@@ -5200,23 +5372,23 @@
     </w:p>
     <w:p>
       <w:pPr>
-        <w:pStyle w:val="Compact"/>
         <w:numPr>
           <w:ilvl w:val="0"/>
           <w:numId w:val="1008"/>
         </w:numPr>
-      </w:pPr>
-      <w:r>
-        <w:rPr>
+        <w:pStyle w:val="Compact"/>
+      </w:pPr>
+      <w:r>
+        <w:rPr>
+          <w:bCs/>
           <w:b/>
+        </w:rPr>
+        <w:t xml:space="preserve">Body, for</w:t>
+      </w:r>
+      <w:r>
+        <w:rPr>
           <w:bCs/>
-        </w:rPr>
-        <w:t xml:space="preserve">Body, for</w:t>
-      </w:r>
-      <w:r>
-        <w:rPr>
           <w:b/>
-          <w:bCs/>
         </w:rPr>
         <w:t xml:space="preserve"> </w:t>
       </w:r>
@@ -5248,8 +5420,8 @@
       </m:oMath>
       <w:r>
         <w:rPr>
+          <w:bCs/>
           <w:b/>
-          <w:bCs/>
         </w:rPr>
         <w:t xml:space="preserve">:</w:t>
       </w:r>
@@ -5263,8 +5435,8 @@
         <m:d>
           <m:dPr>
             <m:begChr m:val="("/>
+            <m:endChr m:val=")"/>
             <m:sepChr m:val=""/>
-            <m:endChr m:val=")"/>
             <m:grow/>
           </m:dPr>
           <m:e>
@@ -5294,8 +5466,8 @@
       </w:r>
       <w:r>
         <w:rPr>
+          <w:bCs/>
           <w:b/>
-          <w:bCs/>
         </w:rPr>
         <w:t xml:space="preserve">truncated</w:t>
       </w:r>
@@ -5401,23 +5573,23 @@
     </w:p>
     <w:p>
       <w:pPr>
-        <w:pStyle w:val="Compact"/>
         <w:numPr>
           <w:ilvl w:val="0"/>
           <w:numId w:val="1008"/>
         </w:numPr>
-      </w:pPr>
-      <w:r>
-        <w:rPr>
+        <w:pStyle w:val="Compact"/>
+      </w:pPr>
+      <w:r>
+        <w:rPr>
+          <w:bCs/>
           <w:b/>
+        </w:rPr>
+        <w:t xml:space="preserve">Tail, for</w:t>
+      </w:r>
+      <w:r>
+        <w:rPr>
           <w:bCs/>
-        </w:rPr>
-        <w:t xml:space="preserve">Tail, for</w:t>
-      </w:r>
-      <w:r>
-        <w:rPr>
           <w:b/>
-          <w:bCs/>
         </w:rPr>
         <w:t xml:space="preserve"> </w:t>
       </w:r>
@@ -5437,8 +5609,8 @@
       </m:oMath>
       <w:r>
         <w:rPr>
+          <w:bCs/>
           <w:b/>
-          <w:bCs/>
         </w:rPr>
         <w:t xml:space="preserve">:</w:t>
       </w:r>
@@ -5559,8 +5731,8 @@
               <m:d>
                 <m:dPr>
                   <m:begChr m:val="("/>
+                  <m:endChr m:val=")"/>
                   <m:sepChr m:val=""/>
-                  <m:endChr m:val=")"/>
                   <m:grow/>
                 </m:dPr>
                 <m:e>
@@ -5645,16 +5817,16 @@
     </w:p>
     <w:p>
       <w:pPr>
-        <w:pStyle w:val="Compact"/>
         <w:numPr>
           <w:ilvl w:val="0"/>
           <w:numId w:val="1009"/>
         </w:numPr>
-      </w:pPr>
-      <w:r>
-        <w:rPr>
+        <w:pStyle w:val="Compact"/>
+      </w:pPr>
+      <w:r>
+        <w:rPr>
+          <w:bCs/>
           <w:b/>
-          <w:bCs/>
         </w:rPr>
         <w:t xml:space="preserve">Tail weight:</w:t>
       </w:r>
@@ -5695,8 +5867,8 @@
           <m:d>
             <m:dPr>
               <m:begChr m:val="("/>
+              <m:endChr m:val=")"/>
               <m:sepChr m:val=""/>
-              <m:endChr m:val=")"/>
               <m:grow/>
             </m:dPr>
             <m:e>
@@ -5934,8 +6106,8 @@
       </w:pPr>
       <w:r>
         <w:rPr>
+          <w:bCs/>
           <w:b/>
-          <w:bCs/>
         </w:rPr>
         <w:t xml:space="preserve">Conditional survival function</w:t>
       </w:r>
@@ -5949,8 +6121,8 @@
         <m:d>
           <m:dPr>
             <m:begChr m:val="("/>
+            <m:endChr m:val=")"/>
             <m:sepChr m:val=""/>
-            <m:endChr m:val=")"/>
             <m:grow/>
           </m:dPr>
           <m:e>
@@ -5971,8 +6143,8 @@
         <m:d>
           <m:dPr>
             <m:begChr m:val="("/>
+            <m:endChr m:val=")"/>
             <m:sepChr m:val=""/>
-            <m:endChr m:val=")"/>
             <m:grow/>
           </m:dPr>
           <m:e>
@@ -6037,8 +6209,8 @@
           <m:d>
             <m:dPr>
               <m:begChr m:val="("/>
+              <m:endChr m:val=")"/>
               <m:sepChr m:val=""/>
-              <m:endChr m:val=")"/>
               <m:grow/>
             </m:dPr>
             <m:e>
@@ -6056,8 +6228,8 @@
           <m:d>
             <m:dPr>
               <m:begChr m:val="{"/>
+              <m:endChr m:val=""/>
               <m:sepChr m:val=""/>
-              <m:endChr m:val=""/>
               <m:grow/>
             </m:dPr>
             <m:e>
@@ -6109,8 +6281,8 @@
                     <m:d>
                       <m:dPr>
                         <m:begChr m:val="("/>
+                        <m:endChr m:val=")"/>
                         <m:sepChr m:val=""/>
-                        <m:endChr m:val=")"/>
                         <m:grow/>
                       </m:dPr>
                       <m:e>
@@ -6154,8 +6326,8 @@
                         <m:d>
                           <m:dPr>
                             <m:begChr m:val="("/>
+                            <m:endChr m:val=")"/>
                             <m:sepChr m:val=""/>
-                            <m:endChr m:val=")"/>
                             <m:grow/>
                           </m:dPr>
                           <m:e>
@@ -6188,8 +6360,8 @@
                         <m:d>
                           <m:dPr>
                             <m:begChr m:val="("/>
+                            <m:endChr m:val=")"/>
                             <m:sepChr m:val=""/>
-                            <m:endChr m:val=")"/>
                             <m:grow/>
                           </m:dPr>
                           <m:e>
@@ -6218,8 +6390,8 @@
                         <m:d>
                           <m:dPr>
                             <m:begChr m:val="("/>
+                            <m:endChr m:val=")"/>
                             <m:sepChr m:val=""/>
-                            <m:endChr m:val=")"/>
                             <m:grow/>
                           </m:dPr>
                           <m:e>
@@ -6252,8 +6424,8 @@
                         <m:d>
                           <m:dPr>
                             <m:begChr m:val="("/>
+                            <m:endChr m:val=")"/>
                             <m:sepChr m:val=""/>
-                            <m:endChr m:val=")"/>
                             <m:grow/>
                           </m:dPr>
                           <m:e>
@@ -6314,8 +6486,8 @@
                         <m:d>
                           <m:dPr>
                             <m:begChr m:val="("/>
+                            <m:endChr m:val=")"/>
                             <m:sepChr m:val=""/>
-                            <m:endChr m:val=")"/>
                             <m:grow/>
                           </m:dPr>
                           <m:e>
@@ -6411,8 +6583,8 @@
       </w:pPr>
       <w:r>
         <w:rPr>
+          <w:bCs/>
           <w:b/>
-          <w:bCs/>
         </w:rPr>
         <w:t xml:space="preserve">Threshold choice.</w:t>
       </w:r>
@@ -6514,16 +6686,16 @@
     </w:p>
     <w:p>
       <w:pPr>
-        <w:pStyle w:val="Compact"/>
         <w:numPr>
           <w:ilvl w:val="0"/>
           <w:numId w:val="1010"/>
         </w:numPr>
-      </w:pPr>
-      <w:r>
-        <w:rPr>
+        <w:pStyle w:val="Compact"/>
+      </w:pPr>
+      <w:r>
+        <w:rPr>
+          <w:bCs/>
           <w:b/>
-          <w:bCs/>
         </w:rPr>
         <w:t xml:space="preserve">Draw the count.</w:t>
       </w:r>
@@ -6565,16 +6737,16 @@
     </w:p>
     <w:p>
       <w:pPr>
-        <w:pStyle w:val="Compact"/>
         <w:numPr>
           <w:ilvl w:val="0"/>
           <w:numId w:val="1010"/>
         </w:numPr>
-      </w:pPr>
-      <w:r>
-        <w:rPr>
+        <w:pStyle w:val="Compact"/>
+      </w:pPr>
+      <w:r>
+        <w:rPr>
+          <w:bCs/>
           <w:b/>
-          <w:bCs/>
         </w:rPr>
         <w:t xml:space="preserve">Draw the severities.</w:t>
       </w:r>
@@ -6777,8 +6949,8 @@
       </w:pPr>
       <w:r>
         <w:rPr>
+          <w:bCs/>
           <w:b/>
-          <w:bCs/>
         </w:rPr>
         <w:t xml:space="preserve">Applying a layer.</w:t>
       </w:r>
@@ -6853,8 +7025,8 @@
           <m:d>
             <m:dPr>
               <m:begChr m:val="("/>
+              <m:endChr m:val=")"/>
               <m:sepChr m:val=""/>
-              <m:endChr m:val=")"/>
               <m:grow/>
             </m:dPr>
             <m:e>
@@ -6878,8 +7050,8 @@
           <m:d>
             <m:dPr>
               <m:begChr m:val="("/>
+              <m:endChr m:val=")"/>
               <m:sepChr m:val=""/>
-              <m:endChr m:val=")"/>
               <m:grow/>
             </m:dPr>
             <m:e>
@@ -6892,8 +7064,8 @@
               <m:d>
                 <m:dPr>
                   <m:begChr m:val="("/>
+                  <m:endChr m:val=")"/>
                   <m:sepChr m:val=""/>
-                  <m:endChr m:val=")"/>
                   <m:grow/>
                 </m:dPr>
                 <m:e>
@@ -6961,8 +7133,8 @@
       </w:r>
       <w:r>
         <w:rPr>
+          <w:bCs/>
           <w:b/>
-          <w:bCs/>
         </w:rPr>
         <w:t xml:space="preserve">in this order</w:t>
       </w:r>
@@ -6972,16 +7144,16 @@
     </w:p>
     <w:p>
       <w:pPr>
-        <w:pStyle w:val="Compact"/>
         <w:numPr>
           <w:ilvl w:val="0"/>
           <w:numId w:val="1011"/>
         </w:numPr>
-      </w:pPr>
-      <w:r>
-        <w:rPr>
+        <w:pStyle w:val="Compact"/>
+      </w:pPr>
+      <w:r>
+        <w:rPr>
+          <w:bCs/>
           <w:b/>
-          <w:bCs/>
         </w:rPr>
         <w:t xml:space="preserve">Annual aggregate deductible (AAD):</w:t>
       </w:r>
@@ -7010,8 +7182,8 @@
         <m:d>
           <m:dPr>
             <m:begChr m:val="("/>
+            <m:endChr m:val=")"/>
             <m:sepChr m:val=""/>
-            <m:endChr m:val=")"/>
             <m:grow/>
           </m:dPr>
           <m:e>
@@ -7059,16 +7231,16 @@
     </w:p>
     <w:p>
       <w:pPr>
-        <w:pStyle w:val="Compact"/>
         <w:numPr>
           <w:ilvl w:val="0"/>
           <w:numId w:val="1011"/>
         </w:numPr>
-      </w:pPr>
-      <w:r>
-        <w:rPr>
+        <w:pStyle w:val="Compact"/>
+      </w:pPr>
+      <w:r>
+        <w:rPr>
+          <w:bCs/>
           <w:b/>
-          <w:bCs/>
         </w:rPr>
         <w:t xml:space="preserve">Annual aggregate limit (AAL):</w:t>
       </w:r>
@@ -7097,8 +7269,8 @@
         <m:d>
           <m:dPr>
             <m:begChr m:val="("/>
+            <m:endChr m:val=")"/>
             <m:sepChr m:val=""/>
-            <m:endChr m:val=")"/>
             <m:grow/>
           </m:dPr>
           <m:e>
@@ -7190,16 +7362,16 @@
     </w:p>
     <w:p>
       <w:pPr>
-        <w:pStyle w:val="Compact"/>
         <w:numPr>
           <w:ilvl w:val="0"/>
           <w:numId w:val="1012"/>
         </w:numPr>
-      </w:pPr>
-      <w:r>
-        <w:rPr>
+        <w:pStyle w:val="Compact"/>
+      </w:pPr>
+      <w:r>
+        <w:rPr>
+          <w:bCs/>
           <w:b/>
-          <w:bCs/>
         </w:rPr>
         <w:t xml:space="preserve">Expected loss</w:t>
       </w:r>
@@ -7213,8 +7385,8 @@
         <m:d>
           <m:dPr>
             <m:begChr m:val="["/>
+            <m:endChr m:val="]"/>
             <m:sepChr m:val=""/>
-            <m:endChr m:val="]"/>
             <m:grow/>
           </m:dPr>
           <m:e>
@@ -7230,16 +7402,16 @@
     </w:p>
     <w:p>
       <w:pPr>
-        <w:pStyle w:val="Compact"/>
         <w:numPr>
           <w:ilvl w:val="0"/>
           <w:numId w:val="1012"/>
         </w:numPr>
-      </w:pPr>
-      <w:r>
-        <w:rPr>
+        <w:pStyle w:val="Compact"/>
+      </w:pPr>
+      <w:r>
+        <w:rPr>
+          <w:bCs/>
           <w:b/>
-          <w:bCs/>
         </w:rPr>
         <w:t xml:space="preserve">Standard deviation</w:t>
       </w:r>
@@ -7262,8 +7434,8 @@
         <m:d>
           <m:dPr>
             <m:begChr m:val="["/>
+            <m:endChr m:val="]"/>
             <m:sepChr m:val=""/>
-            <m:endChr m:val="]"/>
             <m:grow/>
           </m:dPr>
           <m:e>
@@ -7279,16 +7451,16 @@
     </w:p>
     <w:p>
       <w:pPr>
-        <w:pStyle w:val="Compact"/>
         <w:numPr>
           <w:ilvl w:val="0"/>
           <w:numId w:val="1012"/>
         </w:numPr>
-      </w:pPr>
-      <w:r>
-        <w:rPr>
+        <w:pStyle w:val="Compact"/>
+      </w:pPr>
+      <w:r>
+        <w:rPr>
+          <w:bCs/>
           <w:b/>
-          <w:bCs/>
         </w:rPr>
         <w:t xml:space="preserve">Value at Risk</w:t>
       </w:r>
@@ -7364,16 +7536,16 @@
     </w:p>
     <w:p>
       <w:pPr>
-        <w:pStyle w:val="Compact"/>
         <w:numPr>
           <w:ilvl w:val="0"/>
           <w:numId w:val="1012"/>
         </w:numPr>
-      </w:pPr>
-      <w:r>
-        <w:rPr>
+        <w:pStyle w:val="Compact"/>
+      </w:pPr>
+      <w:r>
+        <w:rPr>
+          <w:bCs/>
           <w:b/>
-          <w:bCs/>
         </w:rPr>
         <w:t xml:space="preserve">Tail Value at Risk</w:t>
       </w:r>
@@ -7416,13 +7588,267 @@
         </m:sSub>
       </m:oMath>
       <w:r>
-        <w:t xml:space="preserve">, the mean of the losses at or above</w:t>
-      </w:r>
-      <w:r>
-        <w:t xml:space="preserve"> </w:t>
-      </w:r>
-      <w:r>
-        <w:t xml:space="preserve">the VaR.</w:t>
+        <w:t xml:space="preserve"> </w:t>
+      </w:r>
+      <w:r>
+        <w:t xml:space="preserve">(expected shortfall), the mean of</w:t>
+      </w:r>
+      <w:r>
+        <w:t xml:space="preserve"> </w:t>
+      </w:r>
+      <w:r>
+        <w:t xml:space="preserve">the worst</w:t>
+      </w:r>
+      <w:r>
+        <w:t xml:space="preserve"> </w:t>
+      </w:r>
+      <m:oMath>
+        <m:d>
+          <m:dPr>
+            <m:begChr m:val="("/>
+            <m:endChr m:val=")"/>
+            <m:sepChr m:val=""/>
+            <m:grow/>
+          </m:dPr>
+          <m:e>
+            <m:r>
+              <m:t>1</m:t>
+            </m:r>
+            <m:r>
+              <m:rPr>
+                <m:sty m:val="p"/>
+              </m:rPr>
+              <m:t>−</m:t>
+            </m:r>
+            <m:r>
+              <m:t>q</m:t>
+            </m:r>
+          </m:e>
+        </m:d>
+      </m:oMath>
+      <w:r>
+        <w:t xml:space="preserve"> </w:t>
+      </w:r>
+      <w:r>
+        <w:t xml:space="preserve">share of the simulated years: with</w:t>
+      </w:r>
+      <w:r>
+        <w:t xml:space="preserve"> </w:t>
+      </w:r>
+      <m:oMath>
+        <m:r>
+          <m:t>n</m:t>
+        </m:r>
+      </m:oMath>
+      <w:r>
+        <w:t xml:space="preserve"> </w:t>
+      </w:r>
+      <w:r>
+        <w:t xml:space="preserve">simulated years, the</w:t>
+      </w:r>
+      <w:r>
+        <w:t xml:space="preserve"> </w:t>
+      </w:r>
+      <w:r>
+        <w:t xml:space="preserve">average of the largest</w:t>
+      </w:r>
+      <w:r>
+        <w:t xml:space="preserve"> </w:t>
+      </w:r>
+      <m:oMath>
+        <m:r>
+          <m:rPr>
+            <m:sty m:val="p"/>
+          </m:rPr>
+          <m:t>⌈</m:t>
+        </m:r>
+        <m:d>
+          <m:dPr>
+            <m:begChr m:val="("/>
+            <m:endChr m:val=")"/>
+            <m:sepChr m:val=""/>
+            <m:grow/>
+          </m:dPr>
+          <m:e>
+            <m:r>
+              <m:t>1</m:t>
+            </m:r>
+            <m:r>
+              <m:rPr>
+                <m:sty m:val="p"/>
+              </m:rPr>
+              <m:t>−</m:t>
+            </m:r>
+            <m:r>
+              <m:t>q</m:t>
+            </m:r>
+          </m:e>
+        </m:d>
+        <m:r>
+          <m:t> </m:t>
+        </m:r>
+        <m:r>
+          <m:t>n</m:t>
+        </m:r>
+        <m:r>
+          <m:rPr>
+            <m:sty m:val="p"/>
+          </m:rPr>
+          <m:t>⌉</m:t>
+        </m:r>
+      </m:oMath>
+      <w:r>
+        <w:t xml:space="preserve"> </w:t>
+      </w:r>
+      <w:r>
+        <w:t xml:space="preserve">annual losses</w:t>
+      </w:r>
+      <w:r>
+        <w:t xml:space="preserve"> </w:t>
+      </w:r>
+      <w:r>
+        <w:t xml:space="preserve">(</w:t>
+      </w:r>
+      <w:r>
+        <w:rPr>
+          <w:rStyle w:val="VerbatimChar"/>
+        </w:rPr>
+        <w:t xml:space="preserve">expected_shortfall</w:t>
+      </w:r>
+      <w:r>
+        <w:t xml:space="preserve">). This is deliberately not the mean of the losses at or</w:t>
+      </w:r>
+      <w:r>
+        <w:t xml:space="preserve"> </w:t>
+      </w:r>
+      <w:r>
+        <w:t xml:space="preserve">above the VaR. A layer’s annual loss has point masses, many years at exactly</w:t>
+      </w:r>
+      <w:r>
+        <w:t xml:space="preserve"> </w:t>
+      </w:r>
+      <w:r>
+        <w:t xml:space="preserve">0 (the layer is not hit) or at exactly the full limit (a loss exhausts it).</w:t>
+      </w:r>
+      <w:r>
+        <w:t xml:space="preserve"> </w:t>
+      </w:r>
+      <w:r>
+        <w:t xml:space="preserve">When the VaR lands on one of these,</w:t>
+      </w:r>
+      <w:r>
+        <w:t xml:space="preserve"> </w:t>
+      </w:r>
+      <w:r>
+        <w:t xml:space="preserve">“</w:t>
+      </w:r>
+      <w:r>
+        <w:t xml:space="preserve">at or above the VaR</w:t>
+      </w:r>
+      <w:r>
+        <w:t xml:space="preserve">”</w:t>
+      </w:r>
+      <w:r>
+        <w:t xml:space="preserve"> </w:t>
+      </w:r>
+      <w:r>
+        <w:t xml:space="preserve">takes in the whole</w:t>
+      </w:r>
+      <w:r>
+        <w:t xml:space="preserve"> </w:t>
+      </w:r>
+      <w:r>
+        <w:t xml:space="preserve">point mass, so it averages far more than the worst</w:t>
+      </w:r>
+      <w:r>
+        <w:t xml:space="preserve"> </w:t>
+      </w:r>
+      <m:oMath>
+        <m:d>
+          <m:dPr>
+            <m:begChr m:val="("/>
+            <m:endChr m:val=")"/>
+            <m:sepChr m:val=""/>
+            <m:grow/>
+          </m:dPr>
+          <m:e>
+            <m:r>
+              <m:t>1</m:t>
+            </m:r>
+            <m:r>
+              <m:rPr>
+                <m:sty m:val="p"/>
+              </m:rPr>
+              <m:t>−</m:t>
+            </m:r>
+            <m:r>
+              <m:t>q</m:t>
+            </m:r>
+          </m:e>
+        </m:d>
+      </m:oMath>
+      <w:r>
+        <w:t xml:space="preserve"> </w:t>
+      </w:r>
+      <w:r>
+        <w:t xml:space="preserve">of years and</w:t>
+      </w:r>
+      <w:r>
+        <w:t xml:space="preserve"> </w:t>
+      </w:r>
+      <w:r>
+        <w:t xml:space="preserve">understates the tail; for a layer hit in fewer than</w:t>
+      </w:r>
+      <w:r>
+        <w:t xml:space="preserve"> </w:t>
+      </w:r>
+      <m:oMath>
+        <m:d>
+          <m:dPr>
+            <m:begChr m:val="("/>
+            <m:endChr m:val=")"/>
+            <m:sepChr m:val=""/>
+            <m:grow/>
+          </m:dPr>
+          <m:e>
+            <m:r>
+              <m:t>1</m:t>
+            </m:r>
+            <m:r>
+              <m:rPr>
+                <m:sty m:val="p"/>
+              </m:rPr>
+              <m:t>−</m:t>
+            </m:r>
+            <m:r>
+              <m:t>q</m:t>
+            </m:r>
+          </m:e>
+        </m:d>
+      </m:oMath>
+      <w:r>
+        <w:t xml:space="preserve"> </w:t>
+      </w:r>
+      <w:r>
+        <w:t xml:space="preserve">of years the VaR</w:t>
+      </w:r>
+      <w:r>
+        <w:t xml:space="preserve"> </w:t>
+      </w:r>
+      <w:r>
+        <w:t xml:space="preserve">is 0 and that mean collapses to the expected loss. For a continuous loss</w:t>
+      </w:r>
+      <w:r>
+        <w:t xml:space="preserve"> </w:t>
+      </w:r>
+      <w:r>
+        <w:t xml:space="preserve">distribution the two definitions coincide; the expected shortfall is the</w:t>
+      </w:r>
+      <w:r>
+        <w:t xml:space="preserve"> </w:t>
+      </w:r>
+      <w:r>
+        <w:t xml:space="preserve">coherent one and stays correct with point masses.</w:t>
       </w:r>
     </w:p>
     <w:p>
@@ -7546,8 +7972,8 @@
           <m:d>
             <m:dPr>
               <m:begChr m:val="("/>
+              <m:endChr m:val=")"/>
               <m:sepChr m:val=""/>
-              <m:endChr m:val=")"/>
               <m:grow/>
             </m:dPr>
             <m:e>
@@ -7586,8 +8012,8 @@
           <m:d>
             <m:dPr>
               <m:begChr m:val="["/>
+              <m:endChr m:val="]"/>
               <m:sepChr m:val=""/>
-              <m:endChr m:val="]"/>
               <m:grow/>
             </m:dPr>
             <m:e>
@@ -7632,8 +8058,8 @@
           <m:d>
             <m:dPr>
               <m:begChr m:val="["/>
+              <m:endChr m:val="]"/>
               <m:sepChr m:val=""/>
-              <m:endChr m:val="]"/>
               <m:grow/>
             </m:dPr>
             <m:e>
@@ -7681,8 +8107,8 @@
           <m:d>
             <m:dPr>
               <m:begChr m:val="["/>
+              <m:endChr m:val="]"/>
               <m:sepChr m:val=""/>
-              <m:endChr m:val="]"/>
               <m:grow/>
             </m:dPr>
             <m:e>
@@ -7712,8 +8138,8 @@
       </w:r>
       <w:r>
         <w:rPr>
+          <w:bCs/>
           <w:b/>
-          <w:bCs/>
         </w:rPr>
         <w:t xml:space="preserve">pure technical premiums</w:t>
       </w:r>
@@ -7763,7 +8189,13 @@
         <w:t xml:space="preserve">(</w:t>
       </w:r>
       <w:r>
-        <w:t xml:space="preserve">“Darth Vader”</w:t>
+        <w:t xml:space="preserve">“</w:t>
+      </w:r>
+      <w:r>
+        <w:t xml:space="preserve">Darth Vader</w:t>
+      </w:r>
+      <w:r>
+        <w:t xml:space="preserve">”</w:t>
       </w:r>
       <w:r>
         <w:t xml:space="preserve">) identity, as the integral of the survival function over the</w:t>
@@ -7790,8 +8222,8 @@
           <m:d>
             <m:dPr>
               <m:begChr m:val="["/>
+              <m:endChr m:val="]"/>
               <m:sepChr m:val=""/>
-              <m:endChr m:val="]"/>
               <m:grow/>
             </m:dPr>
             <m:e>
@@ -7830,8 +8262,8 @@
           <m:d>
             <m:dPr>
               <m:begChr m:val="["/>
+              <m:endChr m:val="]"/>
               <m:sepChr m:val=""/>
-              <m:endChr m:val="]"/>
               <m:grow/>
             </m:dPr>
             <m:e>
@@ -7881,8 +8313,8 @@
           <m:d>
             <m:dPr>
               <m:begChr m:val="("/>
+              <m:endChr m:val=")"/>
               <m:sepChr m:val=""/>
-              <m:endChr m:val=")"/>
               <m:grow/>
             </m:dPr>
             <m:e>
@@ -7921,8 +8353,8 @@
       </w:r>
       <w:r>
         <w:rPr>
+          <w:bCs/>
           <w:b/>
-          <w:bCs/>
         </w:rPr>
         <w:t xml:space="preserve">deterministic numerical integration</w:t>
       </w:r>
@@ -8071,8 +8503,8 @@
           <m:d>
             <m:dPr>
               <m:begChr m:val="["/>
+              <m:endChr m:val="]"/>
               <m:sepChr m:val=""/>
-              <m:endChr m:val="]"/>
               <m:grow/>
             </m:dPr>
             <m:e>
@@ -8150,8 +8582,8 @@
           <m:d>
             <m:dPr>
               <m:begChr m:val="["/>
+              <m:endChr m:val="]"/>
               <m:sepChr m:val=""/>
-              <m:endChr m:val="]"/>
               <m:grow/>
             </m:dPr>
             <m:e>
@@ -8160,8 +8592,8 @@
                   <m:d>
                     <m:dPr>
                       <m:begChr m:val="("/>
+                      <m:endChr m:val=")"/>
                       <m:sepChr m:val=""/>
-                      <m:endChr m:val=")"/>
                       <m:grow/>
                     </m:dPr>
                     <m:e>
@@ -8230,8 +8662,8 @@
           <m:d>
             <m:dPr>
               <m:begChr m:val="("/>
+              <m:endChr m:val=")"/>
               <m:sepChr m:val=""/>
-              <m:endChr m:val=")"/>
               <m:grow/>
             </m:dPr>
             <m:e>
@@ -8323,8 +8755,8 @@
       </w:r>
       <w:r>
         <w:rPr>
+          <w:bCs/>
           <w:b/>
-          <w:bCs/>
         </w:rPr>
         <w:t xml:space="preserve">burning cost</w:t>
       </w:r>
@@ -8404,16 +8836,16 @@
     </w:p>
     <w:p>
       <w:pPr>
-        <w:pStyle w:val="Compact"/>
         <w:numPr>
           <w:ilvl w:val="0"/>
           <w:numId w:val="1013"/>
         </w:numPr>
-      </w:pPr>
-      <w:r>
-        <w:rPr>
+        <w:pStyle w:val="Compact"/>
+      </w:pPr>
+      <w:r>
+        <w:rPr>
+          <w:bCs/>
           <w:b/>
-          <w:bCs/>
         </w:rPr>
         <w:t xml:space="preserve">Short-tail business.</w:t>
       </w:r>
@@ -8432,16 +8864,16 @@
     </w:p>
     <w:p>
       <w:pPr>
-        <w:pStyle w:val="Compact"/>
         <w:numPr>
           <w:ilvl w:val="0"/>
           <w:numId w:val="1013"/>
         </w:numPr>
-      </w:pPr>
-      <w:r>
-        <w:rPr>
+        <w:pStyle w:val="Compact"/>
+      </w:pPr>
+      <w:r>
+        <w:rPr>
+          <w:bCs/>
           <w:b/>
-          <w:bCs/>
         </w:rPr>
         <w:t xml:space="preserve">Non-proportional only.</w:t>
       </w:r>
@@ -8460,16 +8892,16 @@
     </w:p>
     <w:p>
       <w:pPr>
-        <w:pStyle w:val="Compact"/>
         <w:numPr>
           <w:ilvl w:val="0"/>
           <w:numId w:val="1013"/>
         </w:numPr>
-      </w:pPr>
-      <w:r>
-        <w:rPr>
+        <w:pStyle w:val="Compact"/>
+      </w:pPr>
+      <w:r>
+        <w:rPr>
+          <w:bCs/>
           <w:b/>
-          <w:bCs/>
         </w:rPr>
         <w:t xml:space="preserve">No reinstatements.</w:t>
       </w:r>
@@ -8488,16 +8920,16 @@
     </w:p>
     <w:p>
       <w:pPr>
-        <w:pStyle w:val="Compact"/>
         <w:numPr>
           <w:ilvl w:val="0"/>
           <w:numId w:val="1013"/>
         </w:numPr>
-      </w:pPr>
-      <w:r>
-        <w:rPr>
+        <w:pStyle w:val="Compact"/>
+      </w:pPr>
+      <w:r>
+        <w:rPr>
+          <w:bCs/>
           <w:b/>
-          <w:bCs/>
         </w:rPr>
         <w:t xml:space="preserve">No catastrophe model or exposure curves.</w:t>
       </w:r>
@@ -8516,16 +8948,16 @@
     </w:p>
     <w:p>
       <w:pPr>
-        <w:pStyle w:val="Compact"/>
         <w:numPr>
           <w:ilvl w:val="0"/>
           <w:numId w:val="1013"/>
         </w:numPr>
-      </w:pPr>
-      <w:r>
-        <w:rPr>
+        <w:pStyle w:val="Compact"/>
+      </w:pPr>
+      <w:r>
+        <w:rPr>
+          <w:bCs/>
           <w:b/>
-          <w:bCs/>
         </w:rPr>
         <w:t xml:space="preserve">Distribution selection.</w:t>
       </w:r>
@@ -8610,11 +9042,11 @@
     </w:p>
     <w:p>
       <w:pPr>
-        <w:pStyle w:val="Compact"/>
         <w:numPr>
           <w:ilvl w:val="0"/>
           <w:numId w:val="1014"/>
         </w:numPr>
+        <w:pStyle w:val="Compact"/>
       </w:pPr>
       <w:r>
         <w:t xml:space="preserve">P. Arbenz,</w:t>
@@ -8624,8 +9056,8 @@
       </w:r>
       <w:r>
         <w:rPr>
+          <w:iCs/>
           <w:i/>
-          <w:iCs/>
         </w:rPr>
         <w:t xml:space="preserve">Reinsurance Analytics</w:t>
       </w:r>
@@ -8647,11 +9079,11 @@
     </w:p>
     <w:p>
       <w:pPr>
-        <w:pStyle w:val="Compact"/>
         <w:numPr>
           <w:ilvl w:val="0"/>
           <w:numId w:val="1014"/>
         </w:numPr>
+        <w:pStyle w:val="Compact"/>
       </w:pPr>
       <w:r>
         <w:t xml:space="preserve">P. Parodi,</w:t>
@@ -8661,8 +9093,8 @@
       </w:r>
       <w:r>
         <w:rPr>
+          <w:iCs/>
           <w:i/>
-          <w:iCs/>
         </w:rPr>
         <w:t xml:space="preserve">Pricing in General Insurance</w:t>
       </w:r>
@@ -8684,11 +9116,11 @@
     </w:p>
     <w:p>
       <w:pPr>
-        <w:pStyle w:val="Compact"/>
         <w:numPr>
           <w:ilvl w:val="0"/>
           <w:numId w:val="1014"/>
         </w:numPr>
+        <w:pStyle w:val="Compact"/>
       </w:pPr>
       <w:r>
         <w:t xml:space="preserve">The design and methodology are documented here; the implementation is in the</w:t>
@@ -8725,11 +9157,7 @@
       </w:r>
     </w:p>
     <w:bookmarkEnd w:id="40"/>
-    <w:sectPr>
-      <w:footnotePr>
-        <w:numRestart w:val="eachSect"/>
-      </w:footnotePr>
-    </w:sectPr>
+    <w:sectPr/>
   </w:body>
 </w:document>
 </file>
@@ -8760,14 +9188,14 @@
 <file path=word/numbering.xml><?xml version="1.0" encoding="utf-8"?>
 <w:numbering xmlns:w="http://schemas.openxmlformats.org/wordprocessingml/2006/main">
   <w:abstractNum w:abstractNumId="990">
-    <w:nsid w:val="0000A990"/>
+    <w:nsid w:val="A990"/>
     <w:multiLevelType w:val="multilevel"/>
     <w:lvl w:ilvl="0">
       <w:numFmt w:val="bullet"/>
       <w:lvlText w:val=" "/>
       <w:lvlJc w:val="left"/>
       <w:pPr>
-        <w:ind w:left="720" w:hanging="360"/>
+        <w:ind w:left="720" w:hanging="480"/>
       </w:pPr>
     </w:lvl>
     <w:lvl w:ilvl="1">
@@ -8775,7 +9203,7 @@
       <w:lvlText w:val=" "/>
       <w:lvlJc w:val="left"/>
       <w:pPr>
-        <w:ind w:left="1440" w:hanging="360"/>
+        <w:ind w:left="1440" w:hanging="480"/>
       </w:pPr>
     </w:lvl>
     <w:lvl w:ilvl="2">
@@ -8783,7 +9211,7 @@
       <w:lvlText w:val=" "/>
       <w:lvlJc w:val="left"/>
       <w:pPr>
-        <w:ind w:left="2160" w:hanging="360"/>
+        <w:ind w:left="2160" w:hanging="480"/>
       </w:pPr>
     </w:lvl>
     <w:lvl w:ilvl="3">
@@ -8791,7 +9219,7 @@
       <w:lvlText w:val=" "/>
       <w:lvlJc w:val="left"/>
       <w:pPr>
-        <w:ind w:left="2880" w:hanging="360"/>
+        <w:ind w:left="2880" w:hanging="480"/>
       </w:pPr>
     </w:lvl>
     <w:lvl w:ilvl="4">
@@ -8799,7 +9227,7 @@
       <w:lvlText w:val=" "/>
       <w:lvlJc w:val="left"/>
       <w:pPr>
-        <w:ind w:left="3600" w:hanging="360"/>
+        <w:ind w:left="3600" w:hanging="480"/>
       </w:pPr>
     </w:lvl>
     <w:lvl w:ilvl="5">
@@ -8807,7 +9235,7 @@
       <w:lvlText w:val=" "/>
       <w:lvlJc w:val="left"/>
       <w:pPr>
-        <w:ind w:left="4320" w:hanging="360"/>
+        <w:ind w:left="4320" w:hanging="480"/>
       </w:pPr>
     </w:lvl>
     <w:lvl w:ilvl="6">
@@ -8815,7 +9243,7 @@
       <w:lvlText w:val=" "/>
       <w:lvlJc w:val="left"/>
       <w:pPr>
-        <w:ind w:left="5040" w:hanging="360"/>
+        <w:ind w:left="5040" w:hanging="480"/>
       </w:pPr>
     </w:lvl>
     <w:lvl w:ilvl="7">
@@ -8823,7 +9251,7 @@
       <w:lvlText w:val=" "/>
       <w:lvlJc w:val="left"/>
       <w:pPr>
-        <w:ind w:left="5760" w:hanging="360"/>
+        <w:ind w:left="5760" w:hanging="480"/>
       </w:pPr>
     </w:lvl>
     <w:lvl w:ilvl="8">
@@ -8831,115 +9259,88 @@
       <w:lvlText w:val=" "/>
       <w:lvlJc w:val="left"/>
       <w:pPr>
-        <w:ind w:left="6480" w:hanging="360"/>
+        <w:ind w:left="6480" w:hanging="480"/>
       </w:pPr>
     </w:lvl>
   </w:abstractNum>
   <w:abstractNum w:abstractNumId="991">
-    <w:nsid w:val="0000A991"/>
+    <w:nsid w:val="A991"/>
     <w:multiLevelType w:val="multilevel"/>
     <w:lvl w:ilvl="0">
       <w:numFmt w:val="bullet"/>
-      <w:lvlText w:val=""/>
+      <w:lvlText w:val="•"/>
       <w:lvlJc w:val="left"/>
       <w:pPr>
-        <w:ind w:left="720" w:hanging="360"/>
-      </w:pPr>
-      <w:rPr>
-        <w:rFonts w:ascii="Symbol" w:hAnsi="Symbol" w:cs="Symbol" w:hint="default"/>
-      </w:rPr>
+        <w:ind w:left="720" w:hanging="480"/>
+      </w:pPr>
     </w:lvl>
     <w:lvl w:ilvl="1">
       <w:numFmt w:val="bullet"/>
-      <w:lvlText w:val="o"/>
+      <w:lvlText w:val="–"/>
       <w:lvlJc w:val="left"/>
       <w:pPr>
-        <w:ind w:left="1440" w:hanging="360"/>
-      </w:pPr>
-      <w:rPr>
-        <w:rFonts w:ascii="Courier New" w:hAnsi="Courier New" w:cs="Courier New" w:hint="default"/>
-      </w:rPr>
+        <w:ind w:left="1440" w:hanging="480"/>
+      </w:pPr>
     </w:lvl>
     <w:lvl w:ilvl="2">
       <w:numFmt w:val="bullet"/>
-      <w:lvlText w:val=""/>
+      <w:lvlText w:val="•"/>
       <w:lvlJc w:val="left"/>
       <w:pPr>
-        <w:ind w:left="2160" w:hanging="360"/>
-      </w:pPr>
-      <w:rPr>
-        <w:rFonts w:ascii="Wingdings" w:hAnsi="Wingdings" w:cs="Wingdings" w:hint="default"/>
-      </w:rPr>
+        <w:ind w:left="2160" w:hanging="480"/>
+      </w:pPr>
     </w:lvl>
     <w:lvl w:ilvl="3">
       <w:numFmt w:val="bullet"/>
-      <w:lvlText w:val=""/>
+      <w:lvlText w:val="–"/>
       <w:lvlJc w:val="left"/>
       <w:pPr>
-        <w:ind w:left="2880" w:hanging="360"/>
-      </w:pPr>
-      <w:rPr>
-        <w:rFonts w:ascii="Symbol" w:hAnsi="Symbol" w:cs="Symbol" w:hint="default"/>
-      </w:rPr>
+        <w:ind w:left="2880" w:hanging="480"/>
+      </w:pPr>
     </w:lvl>
     <w:lvl w:ilvl="4">
       <w:numFmt w:val="bullet"/>
-      <w:lvlText w:val="o"/>
+      <w:lvlText w:val="•"/>
       <w:lvlJc w:val="left"/>
       <w:pPr>
-        <w:ind w:left="3600" w:hanging="360"/>
-      </w:pPr>
-      <w:rPr>
-        <w:rFonts w:ascii="Courier New" w:hAnsi="Courier New" w:cs="Courier New" w:hint="default"/>
-      </w:rPr>
+        <w:ind w:left="3600" w:hanging="480"/>
+      </w:pPr>
     </w:lvl>
     <w:lvl w:ilvl="5">
       <w:numFmt w:val="bullet"/>
-      <w:lvlText w:val=""/>
+      <w:lvlText w:val="–"/>
       <w:lvlJc w:val="left"/>
       <w:pPr>
-        <w:ind w:left="4320" w:hanging="360"/>
-      </w:pPr>
-      <w:rPr>
-        <w:rFonts w:ascii="Wingdings" w:hAnsi="Wingdings" w:cs="Wingdings" w:hint="default"/>
-      </w:rPr>
+        <w:ind w:left="4320" w:hanging="480"/>
+      </w:pPr>
     </w:lvl>
     <w:lvl w:ilvl="6">
       <w:numFmt w:val="bullet"/>
-      <w:lvlText w:val=""/>
+      <w:lvlText w:val="•"/>
       <w:lvlJc w:val="left"/>
       <w:pPr>
-        <w:ind w:left="5040" w:hanging="360"/>
-      </w:pPr>
-      <w:rPr>
-        <w:rFonts w:ascii="Symbol" w:hAnsi="Symbol" w:cs="Symbol" w:hint="default"/>
-      </w:rPr>
+        <w:ind w:left="5040" w:hanging="480"/>
+      </w:pPr>
     </w:lvl>
     <w:lvl w:ilvl="7">
       <w:numFmt w:val="bullet"/>
-      <w:lvlText w:val="o"/>
+      <w:lvlText w:val="–"/>
       <w:lvlJc w:val="left"/>
       <w:pPr>
-        <w:ind w:left="5760" w:hanging="360"/>
-      </w:pPr>
-      <w:rPr>
-        <w:rFonts w:ascii="Courier New" w:hAnsi="Courier New" w:cs="Courier New" w:hint="default"/>
-      </w:rPr>
+        <w:ind w:left="5760" w:hanging="480"/>
+      </w:pPr>
     </w:lvl>
     <w:lvl w:ilvl="8">
       <w:numFmt w:val="bullet"/>
-      <w:lvlText w:val=""/>
+      <w:lvlText w:val="•"/>
       <w:lvlJc w:val="left"/>
       <w:pPr>
-        <w:ind w:left="6480" w:hanging="360"/>
-      </w:pPr>
-      <w:rPr>
-        <w:rFonts w:ascii="Wingdings" w:hAnsi="Wingdings" w:cs="Wingdings" w:hint="default"/>
-      </w:rPr>
+        <w:ind w:left="6480" w:hanging="480"/>
+      </w:pPr>
     </w:lvl>
   </w:abstractNum>
   <w:abstractNum w:abstractNumId="99411">
-    <w:nsid w:val="00A99411"/>
+    <w:nsid w:val="A99411"/>
     <w:multiLevelType w:val="multilevel"/>
     <w:lvl w:ilvl="0">
       <w:start w:val="1"/>
@@ -8947,7 +9348,7 @@
       <w:lvlText w:val="%1."/>
       <w:lvlJc w:val="left"/>
       <w:pPr>
-        <w:ind w:left="720" w:hanging="360"/>
+        <w:ind w:left="720" w:hanging="480"/>
       </w:pPr>
     </w:lvl>
     <w:lvl w:ilvl="1">
@@ -8956,7 +9357,7 @@
       <w:lvlText w:val="%2."/>
       <w:lvlJc w:val="left"/>
       <w:pPr>
-        <w:ind w:left="1440" w:hanging="360"/>
+        <w:ind w:left="1440" w:hanging="480"/>
       </w:pPr>
     </w:lvl>
     <w:lvl w:ilvl="2">
@@ -8965,7 +9366,7 @@
       <w:lvlText w:val="%3."/>
       <w:lvlJc w:val="left"/>
       <w:pPr>
-        <w:ind w:left="2160" w:hanging="360"/>
+        <w:ind w:left="2160" w:hanging="480"/>
       </w:pPr>
     </w:lvl>
     <w:lvl w:ilvl="3">
@@ -8974,7 +9375,7 @@
       <w:lvlText w:val="%4."/>
       <w:lvlJc w:val="left"/>
       <w:pPr>
-        <w:ind w:left="2880" w:hanging="360"/>
+        <w:ind w:left="2880" w:hanging="480"/>
       </w:pPr>
     </w:lvl>
     <w:lvl w:ilvl="4">
@@ -8983,7 +9384,7 @@
       <w:lvlText w:val="%5."/>
       <w:lvlJc w:val="left"/>
       <w:pPr>
-        <w:ind w:left="3600" w:hanging="360"/>
+        <w:ind w:left="3600" w:hanging="480"/>
       </w:pPr>
     </w:lvl>
     <w:lvl w:ilvl="5">
@@ -8992,7 +9393,7 @@
       <w:lvlText w:val="%6."/>
       <w:lvlJc w:val="left"/>
       <w:pPr>
-        <w:ind w:left="4320" w:hanging="360"/>
+        <w:ind w:left="4320" w:hanging="480"/>
       </w:pPr>
     </w:lvl>
     <w:lvl w:ilvl="6">
@@ -9001,7 +9402,7 @@
       <w:lvlText w:val="%7."/>
       <w:lvlJc w:val="left"/>
       <w:pPr>
-        <w:ind w:left="5040" w:hanging="360"/>
+        <w:ind w:left="5040" w:hanging="480"/>
       </w:pPr>
     </w:lvl>
     <w:lvl w:ilvl="7">
@@ -9010,7 +9411,7 @@
       <w:lvlText w:val="%8."/>
       <w:lvlJc w:val="left"/>
       <w:pPr>
-        <w:ind w:left="5760" w:hanging="360"/>
+        <w:ind w:left="5760" w:hanging="480"/>
       </w:pPr>
     </w:lvl>
     <w:lvl w:ilvl="8">
@@ -9019,7 +9420,7 @@
       <w:lvlText w:val="%9."/>
       <w:lvlJc w:val="left"/>
       <w:pPr>
-        <w:ind w:left="6480" w:hanging="360"/>
+        <w:ind w:left="6480" w:hanging="480"/>
       </w:pPr>
     </w:lvl>
   </w:abstractNum>
@@ -9178,10 +9579,10 @@
     <w:name w:val="Body Text"/>
     <w:basedOn w:val="Normal"/>
     <w:link w:val="BodyTextChar"/>
-    <w:qFormat/>
     <w:pPr>
       <w:spacing w:after="180" w:before="180"/>
     </w:pPr>
+    <w:qFormat/>
   </w:style>
   <w:style w:customStyle="1" w:styleId="FirstParagraph" w:type="paragraph">
     <w:name w:val="First Paragraph"/>
@@ -9201,94 +9602,57 @@
     <w:name w:val="Title"/>
     <w:basedOn w:val="Normal"/>
     <w:next w:val="BodyText"/>
-    <w:link w:val="TitleChar"/>
-    <w:uiPriority w:val="10"/>
     <w:qFormat/>
-    <w:rsid w:val="00A10FD9"/>
     <w:pPr>
-      <w:spacing w:after="80" w:line="240" w:lineRule="auto"/>
-      <w:contextualSpacing/>
+      <w:keepNext/>
+      <w:keepLines/>
+      <w:spacing w:after="240" w:before="480"/>
       <w:jc w:val="center"/>
     </w:pPr>
     <w:rPr>
       <w:rFonts w:asciiTheme="majorHAnsi" w:cstheme="majorBidi" w:eastAsiaTheme="majorEastAsia" w:hAnsiTheme="majorHAnsi"/>
-      <w:sz w:val="56"/>
-      <w:szCs w:val="56"/>
-    </w:rPr>
-  </w:style>
-  <w:style w:customStyle="1" w:styleId="TitleChar" w:type="character">
-    <w:name w:val="Title Char"/>
-    <w:basedOn w:val="DefaultParagraphFont"/>
-    <w:link w:val="Title"/>
-    <w:uiPriority w:val="10"/>
-    <w:rsid w:val="00A10FD9"/>
-    <w:rPr>
-      <w:rFonts w:asciiTheme="majorHAnsi" w:cstheme="majorBidi" w:eastAsiaTheme="majorEastAsia" w:hAnsiTheme="majorHAnsi"/>
-      <w:sz w:val="56"/>
-      <w:szCs w:val="56"/>
+      <w:b/>
+      <w:bCs/>
+      <w:color w:themeColor="accent1" w:themeShade="B5" w:val="345A8A"/>
+      <w:sz w:val="36"/>
+      <w:szCs w:val="36"/>
     </w:rPr>
   </w:style>
   <w:style w:styleId="Subtitle" w:type="paragraph">
     <w:name w:val="Subtitle"/>
     <w:basedOn w:val="Title"/>
     <w:next w:val="BodyText"/>
-    <w:link w:val="SubtitleChar"/>
-    <w:uiPriority w:val="11"/>
     <w:qFormat/>
-    <w:rsid w:val="00A10FD9"/>
     <w:pPr>
-      <w:numPr>
-        <w:ilvl w:val="1"/>
-      </w:numPr>
+      <w:keepNext/>
+      <w:keepLines/>
+      <w:spacing w:after="240" w:before="240"/>
+      <w:jc w:val="center"/>
     </w:pPr>
     <w:rPr>
-      <w:rFonts w:cstheme="majorBidi" w:eastAsiaTheme="majorEastAsia"/>
-      <w:spacing w:val="15"/>
-      <w:sz w:val="28"/>
-      <w:szCs w:val="28"/>
-    </w:rPr>
-  </w:style>
-  <w:style w:customStyle="1" w:styleId="SubtitleChar" w:type="character">
-    <w:name w:val="Subtitle Char"/>
-    <w:basedOn w:val="DefaultParagraphFont"/>
-    <w:link w:val="Subtitle"/>
-    <w:uiPriority w:val="11"/>
-    <w:rsid w:val="00A10FD9"/>
-    <w:rPr>
-      <w:rFonts w:cstheme="majorBidi" w:eastAsiaTheme="majorEastAsia"/>
-      <w:color w:themeColor="text1" w:themeTint="A6" w:val="595959"/>
-      <w:spacing w:val="15"/>
-      <w:sz w:val="28"/>
-      <w:szCs w:val="28"/>
+      <w:sz w:val="30"/>
+      <w:szCs w:val="30"/>
     </w:rPr>
   </w:style>
   <w:style w:customStyle="1" w:styleId="Author" w:type="paragraph">
     <w:name w:val="Author"/>
-    <w:basedOn w:val="Title"/>
     <w:next w:val="BodyText"/>
     <w:qFormat/>
     <w:pPr>
       <w:keepNext/>
       <w:keepLines/>
+      <w:jc w:val="center"/>
     </w:pPr>
-    <w:rPr>
-      <w:sz w:val="24"/>
-      <w:szCs w:val="24"/>
-    </w:rPr>
   </w:style>
   <w:style w:styleId="Date" w:type="paragraph">
     <w:name w:val="Date"/>
-    <w:basedOn w:val="Title"/>
     <w:next w:val="BodyText"/>
     <w:qFormat/>
     <w:pPr>
       <w:keepNext/>
       <w:keepLines/>
+      <w:jc w:val="center"/>
     </w:pPr>
-    <w:rPr>
-      <w:sz w:val="24"/>
-      <w:szCs w:val="24"/>
-    </w:rPr>
   </w:style>
   <w:style w:customStyle="1" w:styleId="AbstractTitle" w:type="paragraph">
     <w:name w:val="Abstract Title"/>
@@ -9298,13 +9662,15 @@
     <w:pPr>
       <w:keepNext/>
       <w:keepLines/>
+      <w:jc w:val="center"/>
       <w:spacing w:after="0" w:before="300"/>
-      <w:jc w:val="center"/>
     </w:pPr>
     <w:rPr>
-      <w:b/>
       <w:sz w:val="20"/>
       <w:szCs w:val="20"/>
+      <w:b/>
+      <w:color w:val="345A8A"/>
+      &gt;
     </w:rPr>
   </w:style>
   <w:style w:customStyle="1" w:styleId="Abstract" w:type="paragraph">
@@ -9331,321 +9697,191 @@
     <w:rPr/>
   </w:style>
   <w:style w:styleId="Heading1" w:type="paragraph">
-    <w:name w:val="heading 1"/>
+    <w:name w:val="Heading 1"/>
     <w:basedOn w:val="Normal"/>
     <w:next w:val="BodyText"/>
-    <w:link w:val="Heading1Char"/>
     <w:uiPriority w:val="9"/>
     <w:qFormat/>
-    <w:rsid w:val="00A10FD9"/>
     <w:pPr>
       <w:keepNext/>
       <w:keepLines/>
-      <w:spacing w:after="80" w:before="360"/>
+      <w:spacing w:after="0" w:before="480"/>
       <w:outlineLvl w:val="0"/>
     </w:pPr>
     <w:rPr>
       <w:rFonts w:asciiTheme="majorHAnsi" w:cstheme="majorBidi" w:eastAsiaTheme="majorEastAsia" w:hAnsiTheme="majorHAnsi"/>
-      <w:color w:themeColor="accent1" w:themeShade="BF" w:val="0F4761"/>
-      <w:sz w:val="40"/>
-      <w:szCs w:val="40"/>
+      <w:b/>
+      <w:bCs/>
+      <w:color w:themeColor="accent1" w:val="4F81BD"/>
+      <w:sz w:val="32"/>
+      <w:szCs w:val="32"/>
     </w:rPr>
   </w:style>
   <w:style w:styleId="Heading2" w:type="paragraph">
-    <w:name w:val="heading 2"/>
+    <w:name w:val="Heading 2"/>
     <w:basedOn w:val="Normal"/>
     <w:next w:val="BodyText"/>
-    <w:link w:val="Heading2Char"/>
     <w:uiPriority w:val="9"/>
-    <w:semiHidden/>
     <w:unhideWhenUsed/>
     <w:qFormat/>
-    <w:rsid w:val="00A10FD9"/>
     <w:pPr>
       <w:keepNext/>
       <w:keepLines/>
-      <w:spacing w:after="80" w:before="160"/>
+      <w:spacing w:after="0" w:before="200"/>
       <w:outlineLvl w:val="1"/>
     </w:pPr>
     <w:rPr>
       <w:rFonts w:asciiTheme="majorHAnsi" w:cstheme="majorBidi" w:eastAsiaTheme="majorEastAsia" w:hAnsiTheme="majorHAnsi"/>
-      <w:color w:themeColor="accent1" w:themeShade="BF" w:val="0F4761"/>
-      <w:sz w:val="32"/>
-      <w:szCs w:val="32"/>
-    </w:rPr>
-  </w:style>
-  <w:style w:styleId="Heading3" w:type="paragraph">
-    <w:name w:val="heading 3"/>
-    <w:basedOn w:val="Normal"/>
-    <w:next w:val="BodyText"/>
-    <w:link w:val="Heading3Char"/>
-    <w:uiPriority w:val="9"/>
-    <w:semiHidden/>
-    <w:unhideWhenUsed/>
-    <w:qFormat/>
-    <w:rsid w:val="00A10FD9"/>
-    <w:pPr>
-      <w:keepNext/>
-      <w:keepLines/>
-      <w:spacing w:after="80" w:before="160"/>
-      <w:outlineLvl w:val="2"/>
-    </w:pPr>
-    <w:rPr>
-      <w:rFonts w:cstheme="majorBidi" w:eastAsiaTheme="majorEastAsia"/>
-      <w:color w:themeColor="accent1" w:themeShade="BF" w:val="0F4761"/>
+      <w:b/>
+      <w:bCs/>
+      <w:color w:themeColor="accent1" w:val="4F81BD"/>
       <w:sz w:val="28"/>
       <w:szCs w:val="28"/>
     </w:rPr>
   </w:style>
-  <w:style w:styleId="Heading4" w:type="paragraph">
-    <w:name w:val="heading 4"/>
+  <w:style w:styleId="Heading3" w:type="paragraph">
+    <w:name w:val="Heading 3"/>
     <w:basedOn w:val="Normal"/>
     <w:next w:val="BodyText"/>
-    <w:link w:val="Heading4Char"/>
     <w:uiPriority w:val="9"/>
-    <w:semiHidden/>
     <w:unhideWhenUsed/>
     <w:qFormat/>
-    <w:rsid w:val="00A10FD9"/>
     <w:pPr>
       <w:keepNext/>
       <w:keepLines/>
-      <w:spacing w:after="40" w:before="80"/>
+      <w:spacing w:after="0" w:before="200"/>
+      <w:outlineLvl w:val="2"/>
+    </w:pPr>
+    <w:rPr>
+      <w:rFonts w:asciiTheme="majorHAnsi" w:cstheme="majorBidi" w:eastAsiaTheme="majorEastAsia" w:hAnsiTheme="majorHAnsi"/>
+      <w:b/>
+      <w:bCs/>
+      <w:color w:themeColor="accent1" w:val="4F81BD"/>
+      <w:sz w:val="24"/>
+      <w:szCs w:val="24"/>
+    </w:rPr>
+  </w:style>
+  <w:style w:styleId="Heading4" w:type="paragraph">
+    <w:name w:val="Heading 4"/>
+    <w:basedOn w:val="Normal"/>
+    <w:next w:val="BodyText"/>
+    <w:uiPriority w:val="9"/>
+    <w:unhideWhenUsed/>
+    <w:qFormat/>
+    <w:pPr>
+      <w:keepNext/>
+      <w:keepLines/>
+      <w:spacing w:after="0" w:before="200"/>
       <w:outlineLvl w:val="3"/>
     </w:pPr>
     <w:rPr>
-      <w:rFonts w:cstheme="majorBidi" w:eastAsiaTheme="majorEastAsia"/>
+      <w:rFonts w:asciiTheme="majorHAnsi" w:cstheme="majorBidi" w:eastAsiaTheme="majorEastAsia" w:hAnsiTheme="majorHAnsi"/>
       <w:i/>
-      <w:iCs/>
-      <w:color w:themeColor="accent1" w:themeShade="BF" w:val="0F4761"/>
+      <w:bCs/>
+      <w:color w:themeColor="accent1" w:val="4F81BD"/>
+      <w:sz w:val="24"/>
+      <w:szCs w:val="24"/>
     </w:rPr>
   </w:style>
   <w:style w:styleId="Heading5" w:type="paragraph">
-    <w:name w:val="heading 5"/>
+    <w:name w:val="Heading 5"/>
     <w:basedOn w:val="Normal"/>
     <w:next w:val="BodyText"/>
-    <w:link w:val="Heading5Char"/>
     <w:uiPriority w:val="9"/>
-    <w:semiHidden/>
     <w:unhideWhenUsed/>
     <w:qFormat/>
-    <w:rsid w:val="00A10FD9"/>
     <w:pPr>
       <w:keepNext/>
       <w:keepLines/>
-      <w:spacing w:after="40" w:before="80"/>
+      <w:spacing w:after="0" w:before="200"/>
       <w:outlineLvl w:val="4"/>
     </w:pPr>
     <w:rPr>
-      <w:rFonts w:cstheme="majorBidi" w:eastAsiaTheme="majorEastAsia"/>
-      <w:color w:themeColor="accent1" w:themeShade="BF" w:val="0F4761"/>
+      <w:rFonts w:asciiTheme="majorHAnsi" w:cstheme="majorBidi" w:eastAsiaTheme="majorEastAsia" w:hAnsiTheme="majorHAnsi"/>
+      <w:iCs/>
+      <w:color w:themeColor="accent1" w:val="4F81BD"/>
+      <w:sz w:val="24"/>
+      <w:szCs w:val="24"/>
     </w:rPr>
   </w:style>
   <w:style w:styleId="Heading6" w:type="paragraph">
-    <w:name w:val="heading 6"/>
+    <w:name w:val="Heading 6"/>
     <w:basedOn w:val="Normal"/>
     <w:next w:val="BodyText"/>
-    <w:link w:val="Heading6Char"/>
     <w:uiPriority w:val="9"/>
-    <w:semiHidden/>
     <w:unhideWhenUsed/>
     <w:qFormat/>
-    <w:rsid w:val="00A10FD9"/>
     <w:pPr>
       <w:keepNext/>
       <w:keepLines/>
-      <w:spacing w:after="0" w:before="40"/>
+      <w:spacing w:after="0" w:before="200"/>
       <w:outlineLvl w:val="5"/>
     </w:pPr>
     <w:rPr>
-      <w:rFonts w:cstheme="majorBidi" w:eastAsiaTheme="majorEastAsia"/>
-      <w:i/>
-      <w:iCs/>
-      <w:color w:themeColor="text1" w:themeTint="A6" w:val="595959"/>
+      <w:rFonts w:asciiTheme="majorHAnsi" w:cstheme="majorBidi" w:eastAsiaTheme="majorEastAsia" w:hAnsiTheme="majorHAnsi"/>
+      <w:color w:themeColor="accent1" w:val="4F81BD"/>
+      <w:sz w:val="24"/>
+      <w:szCs w:val="24"/>
     </w:rPr>
   </w:style>
   <w:style w:styleId="Heading7" w:type="paragraph">
-    <w:name w:val="heading 7"/>
+    <w:name w:val="Heading 7"/>
     <w:basedOn w:val="Normal"/>
     <w:next w:val="BodyText"/>
-    <w:link w:val="Heading7Char"/>
     <w:uiPriority w:val="9"/>
-    <w:semiHidden/>
     <w:unhideWhenUsed/>
     <w:qFormat/>
-    <w:rsid w:val="00A10FD9"/>
     <w:pPr>
       <w:keepNext/>
       <w:keepLines/>
-      <w:spacing w:after="0" w:before="40"/>
+      <w:spacing w:after="0" w:before="200"/>
       <w:outlineLvl w:val="6"/>
     </w:pPr>
     <w:rPr>
-      <w:rFonts w:cstheme="majorBidi" w:eastAsiaTheme="majorEastAsia"/>
-      <w:color w:themeColor="text1" w:themeTint="A6" w:val="595959"/>
+      <w:rFonts w:asciiTheme="majorHAnsi" w:cstheme="majorBidi" w:eastAsiaTheme="majorEastAsia" w:hAnsiTheme="majorHAnsi"/>
+      <w:color w:themeColor="accent1" w:val="4F81BD"/>
+      <w:sz w:val="24"/>
+      <w:szCs w:val="24"/>
     </w:rPr>
   </w:style>
   <w:style w:styleId="Heading8" w:type="paragraph">
-    <w:name w:val="heading 8"/>
+    <w:name w:val="Heading 8"/>
     <w:basedOn w:val="Normal"/>
     <w:next w:val="BodyText"/>
-    <w:link w:val="Heading8Char"/>
     <w:uiPriority w:val="9"/>
-    <w:semiHidden/>
     <w:unhideWhenUsed/>
     <w:qFormat/>
-    <w:rsid w:val="00A10FD9"/>
     <w:pPr>
       <w:keepNext/>
       <w:keepLines/>
-      <w:spacing w:after="0"/>
+      <w:spacing w:after="0" w:before="200"/>
       <w:outlineLvl w:val="7"/>
     </w:pPr>
     <w:rPr>
-      <w:rFonts w:cstheme="majorBidi" w:eastAsiaTheme="majorEastAsia"/>
-      <w:i/>
-      <w:iCs/>
-      <w:color w:themeColor="text1" w:themeTint="D8" w:val="272727"/>
+      <w:rFonts w:asciiTheme="majorHAnsi" w:cstheme="majorBidi" w:eastAsiaTheme="majorEastAsia" w:hAnsiTheme="majorHAnsi"/>
+      <w:color w:themeColor="accent1" w:val="4F81BD"/>
+      <w:sz w:val="24"/>
+      <w:szCs w:val="24"/>
     </w:rPr>
   </w:style>
   <w:style w:styleId="Heading9" w:type="paragraph">
-    <w:name w:val="heading 9"/>
+    <w:name w:val="Heading 9"/>
     <w:basedOn w:val="Normal"/>
     <w:next w:val="BodyText"/>
-    <w:link w:val="Heading9Char"/>
     <w:uiPriority w:val="9"/>
-    <w:semiHidden/>
     <w:unhideWhenUsed/>
     <w:qFormat/>
-    <w:rsid w:val="00A10FD9"/>
     <w:pPr>
       <w:keepNext/>
       <w:keepLines/>
-      <w:spacing w:after="0"/>
+      <w:spacing w:after="0" w:before="200"/>
       <w:outlineLvl w:val="8"/>
     </w:pPr>
     <w:rPr>
-      <w:rFonts w:cstheme="majorBidi" w:eastAsiaTheme="majorEastAsia"/>
-      <w:color w:themeColor="text1" w:themeTint="D8" w:val="272727"/>
-    </w:rPr>
-  </w:style>
-  <w:style w:customStyle="1" w:styleId="Heading1Char" w:type="character">
-    <w:name w:val="Heading 1 Char"/>
-    <w:basedOn w:val="DefaultParagraphFont"/>
-    <w:link w:val="Heading1"/>
-    <w:uiPriority w:val="9"/>
-    <w:rsid w:val="00A10FD9"/>
-    <w:rPr>
       <w:rFonts w:asciiTheme="majorHAnsi" w:cstheme="majorBidi" w:eastAsiaTheme="majorEastAsia" w:hAnsiTheme="majorHAnsi"/>
-      <w:color w:themeColor="accent1" w:themeShade="BF" w:val="0F4761"/>
-      <w:sz w:val="40"/>
-      <w:szCs w:val="40"/>
-    </w:rPr>
-  </w:style>
-  <w:style w:customStyle="1" w:styleId="Heading2Char" w:type="character">
-    <w:name w:val="Heading 2 Char"/>
-    <w:basedOn w:val="DefaultParagraphFont"/>
-    <w:link w:val="Heading2"/>
-    <w:uiPriority w:val="9"/>
-    <w:semiHidden/>
-    <w:rsid w:val="00A10FD9"/>
-    <w:rPr>
-      <w:rFonts w:asciiTheme="majorHAnsi" w:cstheme="majorBidi" w:eastAsiaTheme="majorEastAsia" w:hAnsiTheme="majorHAnsi"/>
-      <w:color w:themeColor="accent1" w:themeShade="BF" w:val="0F4761"/>
-      <w:sz w:val="32"/>
-      <w:szCs w:val="32"/>
-    </w:rPr>
-  </w:style>
-  <w:style w:customStyle="1" w:styleId="Heading3Char" w:type="character">
-    <w:name w:val="Heading 3 Char"/>
-    <w:basedOn w:val="DefaultParagraphFont"/>
-    <w:link w:val="Heading3"/>
-    <w:uiPriority w:val="9"/>
-    <w:semiHidden/>
-    <w:rsid w:val="00A10FD9"/>
-    <w:rPr>
-      <w:rFonts w:cstheme="majorBidi" w:eastAsiaTheme="majorEastAsia"/>
-      <w:color w:themeColor="accent1" w:themeShade="BF" w:val="0F4761"/>
-      <w:sz w:val="28"/>
-      <w:szCs w:val="28"/>
-    </w:rPr>
-  </w:style>
-  <w:style w:customStyle="1" w:styleId="Heading4Char" w:type="character">
-    <w:name w:val="Heading 4 Char"/>
-    <w:basedOn w:val="DefaultParagraphFont"/>
-    <w:link w:val="Heading4"/>
-    <w:uiPriority w:val="9"/>
-    <w:semiHidden/>
-    <w:rsid w:val="00A10FD9"/>
-    <w:rPr>
-      <w:rFonts w:cstheme="majorBidi" w:eastAsiaTheme="majorEastAsia"/>
-      <w:i/>
-      <w:iCs/>
-      <w:color w:themeColor="accent1" w:themeShade="BF" w:val="0F4761"/>
-    </w:rPr>
-  </w:style>
-  <w:style w:customStyle="1" w:styleId="Heading5Char" w:type="character">
-    <w:name w:val="Heading 5 Char"/>
-    <w:basedOn w:val="DefaultParagraphFont"/>
-    <w:link w:val="Heading5"/>
-    <w:uiPriority w:val="9"/>
-    <w:semiHidden/>
-    <w:rsid w:val="00A10FD9"/>
-    <w:rPr>
-      <w:rFonts w:cstheme="majorBidi" w:eastAsiaTheme="majorEastAsia"/>
-      <w:color w:themeColor="accent1" w:themeShade="BF" w:val="0F4761"/>
-    </w:rPr>
-  </w:style>
-  <w:style w:customStyle="1" w:styleId="Heading6Char" w:type="character">
-    <w:name w:val="Heading 6 Char"/>
-    <w:basedOn w:val="DefaultParagraphFont"/>
-    <w:link w:val="Heading6"/>
-    <w:uiPriority w:val="9"/>
-    <w:semiHidden/>
-    <w:rsid w:val="00A10FD9"/>
-    <w:rPr>
-      <w:rFonts w:cstheme="majorBidi" w:eastAsiaTheme="majorEastAsia"/>
-      <w:i/>
-      <w:iCs/>
-      <w:color w:themeColor="text1" w:themeTint="A6" w:val="595959"/>
-    </w:rPr>
-  </w:style>
-  <w:style w:customStyle="1" w:styleId="Heading7Char" w:type="character">
-    <w:name w:val="Heading 7 Char"/>
-    <w:basedOn w:val="DefaultParagraphFont"/>
-    <w:link w:val="Heading7"/>
-    <w:uiPriority w:val="9"/>
-    <w:semiHidden/>
-    <w:rsid w:val="00A10FD9"/>
-    <w:rPr>
-      <w:rFonts w:cstheme="majorBidi" w:eastAsiaTheme="majorEastAsia"/>
-      <w:color w:themeColor="text1" w:themeTint="A6" w:val="595959"/>
-    </w:rPr>
-  </w:style>
-  <w:style w:customStyle="1" w:styleId="Heading8Char" w:type="character">
-    <w:name w:val="Heading 8 Char"/>
-    <w:basedOn w:val="DefaultParagraphFont"/>
-    <w:link w:val="Heading8"/>
-    <w:uiPriority w:val="9"/>
-    <w:semiHidden/>
-    <w:rsid w:val="00A10FD9"/>
-    <w:rPr>
-      <w:rFonts w:cstheme="majorBidi" w:eastAsiaTheme="majorEastAsia"/>
-      <w:i/>
-      <w:iCs/>
-      <w:color w:themeColor="text1" w:themeTint="D8" w:val="272727"/>
-    </w:rPr>
-  </w:style>
-  <w:style w:customStyle="1" w:styleId="Heading9Char" w:type="character">
-    <w:name w:val="Heading 9 Char"/>
-    <w:basedOn w:val="DefaultParagraphFont"/>
-    <w:link w:val="Heading9"/>
-    <w:uiPriority w:val="9"/>
-    <w:semiHidden/>
-    <w:rsid w:val="00A10FD9"/>
-    <w:rPr>
-      <w:rFonts w:cstheme="majorBidi" w:eastAsiaTheme="majorEastAsia"/>
-      <w:color w:themeColor="text1" w:themeTint="D8" w:val="272727"/>
+      <w:color w:themeColor="accent1" w:val="4F81BD"/>
+      <w:sz w:val="24"/>
+      <w:szCs w:val="24"/>
     </w:rPr>
   </w:style>
   <w:style w:styleId="BlockText" w:type="paragraph">
@@ -9667,18 +9903,6 @@
     <w:uiPriority w:val="9"/>
     <w:unhideWhenUsed/>
     <w:qFormat/>
-  </w:style>
-  <w:style w:styleId="FootnoteBlockText" w:type="paragraph">
-    <w:name w:val="Footnote Block Text"/>
-    <w:basedOn w:val="FootnoteText"/>
-    <w:next w:val="FootnoteText"/>
-    <w:uiPriority w:val="9"/>
-    <w:unhideWhenUsed/>
-    <w:qFormat/>
-    <w:pPr>
-      <w:spacing w:after="100" w:before="100"/>
-      <w:ind w:firstLine="0" w:left="480" w:right="480"/>
-    </w:pPr>
   </w:style>
   <w:style w:default="1" w:styleId="DefaultParagraphFont" w:type="character">
     <w:name w:val="Default Paragraph Font"/>
@@ -9709,10 +9933,10 @@
         <w:jc w:val="left"/>
       </w:trPr>
       <w:tcPr>
+        <w:vAlign w:val="bottom"/>
         <w:tcBorders>
           <w:bottom w:val="single"/>
         </w:tcBorders>
-        <w:vAlign w:val="bottom"/>
       </w:tcPr>
     </w:tblStylePr>
   </w:style>
@@ -9827,8 +10051,8 @@
     <w:name w:val="KeywordTok"/>
     <w:basedOn w:val="VerbatimChar"/>
     <w:rPr>
+      <w:color w:val="007020"/>
       <w:b/>
-      <w:color w:val="007020"/>
     </w:rPr>
   </w:style>
   <w:style w:type="character" w:customStyle="1" w:styleId="DataTypeTok">
@@ -9905,42 +10129,42 @@
     <w:name w:val="ImportTok"/>
     <w:basedOn w:val="VerbatimChar"/>
     <w:rPr>
+      <w:color w:val="008000"/>
       <w:b/>
-      <w:color w:val="008000"/>
     </w:rPr>
   </w:style>
   <w:style w:type="character" w:customStyle="1" w:styleId="CommentTok">
     <w:name w:val="CommentTok"/>
     <w:basedOn w:val="VerbatimChar"/>
     <w:rPr>
+      <w:color w:val="60a0b0"/>
       <w:i/>
-      <w:color w:val="60a0b0"/>
     </w:rPr>
   </w:style>
   <w:style w:type="character" w:customStyle="1" w:styleId="DocumentationTok">
     <w:name w:val="DocumentationTok"/>
     <w:basedOn w:val="VerbatimChar"/>
     <w:rPr>
+      <w:color w:val="ba2121"/>
       <w:i/>
-      <w:color w:val="ba2121"/>
     </w:rPr>
   </w:style>
   <w:style w:type="character" w:customStyle="1" w:styleId="AnnotationTok">
     <w:name w:val="AnnotationTok"/>
     <w:basedOn w:val="VerbatimChar"/>
     <w:rPr>
+      <w:color w:val="60a0b0"/>
       <w:b/>
       <w:i/>
-      <w:color w:val="60a0b0"/>
     </w:rPr>
   </w:style>
   <w:style w:type="character" w:customStyle="1" w:styleId="CommentVarTok">
     <w:name w:val="CommentVarTok"/>
     <w:basedOn w:val="VerbatimChar"/>
     <w:rPr>
+      <w:color w:val="60a0b0"/>
       <w:b/>
       <w:i/>
-      <w:color w:val="60a0b0"/>
     </w:rPr>
   </w:style>
   <w:style w:type="character" w:customStyle="1" w:styleId="OtherTok">
@@ -9968,8 +10192,8 @@
     <w:name w:val="ControlFlowTok"/>
     <w:basedOn w:val="VerbatimChar"/>
     <w:rPr>
+      <w:color w:val="007020"/>
       <w:b/>
-      <w:color w:val="007020"/>
     </w:rPr>
   </w:style>
   <w:style w:type="character" w:customStyle="1" w:styleId="OperatorTok">
@@ -10014,34 +10238,34 @@
     <w:name w:val="InformationTok"/>
     <w:basedOn w:val="VerbatimChar"/>
     <w:rPr>
+      <w:color w:val="60a0b0"/>
       <w:b/>
       <w:i/>
-      <w:color w:val="60a0b0"/>
     </w:rPr>
   </w:style>
   <w:style w:type="character" w:customStyle="1" w:styleId="WarningTok">
     <w:name w:val="WarningTok"/>
     <w:basedOn w:val="VerbatimChar"/>
     <w:rPr>
+      <w:color w:val="60a0b0"/>
       <w:b/>
       <w:i/>
-      <w:color w:val="60a0b0"/>
     </w:rPr>
   </w:style>
   <w:style w:type="character" w:customStyle="1" w:styleId="AlertTok">
     <w:name w:val="AlertTok"/>
     <w:basedOn w:val="VerbatimChar"/>
     <w:rPr>
+      <w:color w:val="ff0000"/>
       <w:b/>
-      <w:color w:val="ff0000"/>
     </w:rPr>
   </w:style>
   <w:style w:type="character" w:customStyle="1" w:styleId="ErrorTok">
     <w:name w:val="ErrorTok"/>
     <w:basedOn w:val="VerbatimChar"/>
     <w:rPr>
+      <w:color w:val="ff0000"/>
       <w:b/>
-      <w:color w:val="ff0000"/>
     </w:rPr>
   </w:style>
   <w:style w:type="character" w:customStyle="1" w:styleId="NormalTok">
@@ -10063,44 +10287,44 @@
         <a:sysClr val="window" lastClr="FFFFFF"/>
       </a:lt1>
       <a:dk2>
-        <a:srgbClr val="0E2841"/>
+        <a:srgbClr val="1F497D"/>
       </a:dk2>
       <a:lt2>
-        <a:srgbClr val="E8E8E8"/>
+        <a:srgbClr val="EEECE1"/>
       </a:lt2>
       <a:accent1>
-        <a:srgbClr val="156082"/>
+        <a:srgbClr val="4F81BD"/>
       </a:accent1>
       <a:accent2>
-        <a:srgbClr val="E97132"/>
+        <a:srgbClr val="C0504D"/>
       </a:accent2>
       <a:accent3>
-        <a:srgbClr val="196B24"/>
+        <a:srgbClr val="9BBB59"/>
       </a:accent3>
       <a:accent4>
-        <a:srgbClr val="0F9ED5"/>
+        <a:srgbClr val="8064A2"/>
       </a:accent4>
       <a:accent5>
-        <a:srgbClr val="A02B93"/>
+        <a:srgbClr val="4BACC6"/>
       </a:accent5>
       <a:accent6>
-        <a:srgbClr val="4EA72E"/>
+        <a:srgbClr val="F79646"/>
       </a:accent6>
       <a:hlink>
-        <a:srgbClr val="467886"/>
+        <a:srgbClr val="0000FF"/>
       </a:hlink>
       <a:folHlink>
-        <a:srgbClr val="96607D"/>
+        <a:srgbClr val="800080"/>
       </a:folHlink>
     </a:clrScheme>
     <a:fontScheme name="Office">
       <a:majorFont>
-        <a:latin typeface="Aptos Display" panose="02110004020202020204"/>
+        <a:latin typeface="Calibri"/>
         <a:ea typeface=""/>
         <a:cs typeface=""/>
-        <a:font script="Jpan" typeface="游ゴシック Light"/>
+        <a:font script="Jpan" typeface="ＭＳ ゴシック"/>
         <a:font script="Hang" typeface="맑은 고딕"/>
-        <a:font script="Hans" typeface="等线 Light"/>
+        <a:font script="Hans" typeface="宋体"/>
         <a:font script="Hant" typeface="新細明體"/>
         <a:font script="Arab" typeface="Times New Roman"/>
         <a:font script="Hebr" typeface="Times New Roman"/>
@@ -10127,32 +10351,14 @@
         <a:font script="Mong" typeface="Mongolian Baiti"/>
         <a:font script="Viet" typeface="Times New Roman"/>
         <a:font script="Uigh" typeface="Microsoft Uighur"/>
-        <a:font script="Geor" typeface="Sylfaen"/>
-        <a:font script="Armn" typeface="Arial"/>
-        <a:font script="Bugi" typeface="Leelawadee UI"/>
-        <a:font script="Bopo" typeface="Microsoft JhengHei"/>
-        <a:font script="Java" typeface="Javanese Text"/>
-        <a:font script="Lisu" typeface="Segoe UI"/>
-        <a:font script="Mymr" typeface="Myanmar Text"/>
-        <a:font script="Nkoo" typeface="Ebrima"/>
-        <a:font script="Olck" typeface="Nirmala UI"/>
-        <a:font script="Osma" typeface="Ebrima"/>
-        <a:font script="Phag" typeface="Phagspa"/>
-        <a:font script="Syrn" typeface="Estrangelo Edessa"/>
-        <a:font script="Syrj" typeface="Estrangelo Edessa"/>
-        <a:font script="Syre" typeface="Estrangelo Edessa"/>
-        <a:font script="Sora" typeface="Nirmala UI"/>
-        <a:font script="Tale" typeface="Microsoft Tai Le"/>
-        <a:font script="Talu" typeface="Microsoft New Tai Lue"/>
-        <a:font script="Tfng" typeface="Ebrima"/>
       </a:majorFont>
       <a:minorFont>
-        <a:latin typeface="Aptos" panose="02110004020202020204"/>
+        <a:latin typeface="Cambria"/>
         <a:ea typeface=""/>
         <a:cs typeface=""/>
-        <a:font script="Jpan" typeface="游明朝"/>
+        <a:font script="Jpan" typeface="ＭＳ 明朝"/>
         <a:font script="Hang" typeface="맑은 고딕"/>
-        <a:font script="Hans" typeface="等线"/>
+        <a:font script="Hans" typeface="宋体"/>
         <a:font script="Hant" typeface="新細明體"/>
         <a:font script="Arab" typeface="Arial"/>
         <a:font script="Hebr" typeface="Arial"/>
@@ -10179,24 +10385,6 @@
         <a:font script="Mong" typeface="Mongolian Baiti"/>
         <a:font script="Viet" typeface="Arial"/>
         <a:font script="Uigh" typeface="Microsoft Uighur"/>
-        <a:font script="Geor" typeface="Sylfaen"/>
-        <a:font script="Armn" typeface="Arial"/>
-        <a:font script="Bugi" typeface="Leelawadee UI"/>
-        <a:font script="Bopo" typeface="Microsoft JhengHei"/>
-        <a:font script="Java" typeface="Javanese Text"/>
-        <a:font script="Lisu" typeface="Segoe UI"/>
-        <a:font script="Mymr" typeface="Myanmar Text"/>
-        <a:font script="Nkoo" typeface="Ebrima"/>
-        <a:font script="Olck" typeface="Nirmala UI"/>
-        <a:font script="Osma" typeface="Ebrima"/>
-        <a:font script="Phag" typeface="Phagspa"/>
-        <a:font script="Syrn" typeface="Estrangelo Edessa"/>
-        <a:font script="Syrj" typeface="Estrangelo Edessa"/>
-        <a:font script="Syre" typeface="Estrangelo Edessa"/>
-        <a:font script="Sora" typeface="Nirmala UI"/>
-        <a:font script="Tale" typeface="Microsoft Tai Le"/>
-        <a:font script="Talu" typeface="Microsoft New Tai Lue"/>
-        <a:font script="Tfng" typeface="Ebrima"/>
       </a:minorFont>
     </a:fontScheme>
     <a:fmtScheme name="Office">
@@ -10208,141 +10396,200 @@
           <a:gsLst>
             <a:gs pos="0">
               <a:schemeClr val="phClr">
-                <a:lumMod val="110000"/>
-                <a:satMod val="105000"/>
-                <a:tint val="67000"/>
+                <a:tint val="50000"/>
+                <a:satMod val="300000"/>
               </a:schemeClr>
             </a:gs>
-            <a:gs pos="50000">
+            <a:gs pos="35000">
               <a:schemeClr val="phClr">
-                <a:lumMod val="105000"/>
-                <a:satMod val="103000"/>
-                <a:tint val="73000"/>
+                <a:tint val="37000"/>
+                <a:satMod val="300000"/>
               </a:schemeClr>
             </a:gs>
             <a:gs pos="100000">
               <a:schemeClr val="phClr">
-                <a:lumMod val="105000"/>
-                <a:satMod val="109000"/>
-                <a:tint val="81000"/>
+                <a:tint val="15000"/>
+                <a:satMod val="350000"/>
               </a:schemeClr>
             </a:gs>
           </a:gsLst>
-          <a:lin ang="5400000" scaled="0"/>
+          <a:lin ang="16200000" scaled="1"/>
         </a:gradFill>
         <a:gradFill rotWithShape="1">
           <a:gsLst>
             <a:gs pos="0">
               <a:schemeClr val="phClr">
-                <a:satMod val="103000"/>
-                <a:lumMod val="102000"/>
-                <a:tint val="94000"/>
-              </a:schemeClr>
-            </a:gs>
-            <a:gs pos="50000">
-              <a:schemeClr val="phClr">
-                <a:satMod val="110000"/>
-                <a:lumMod val="100000"/>
+                <a:tint val="100000"/>
                 <a:shade val="100000"/>
+                <a:satMod val="130000"/>
               </a:schemeClr>
             </a:gs>
             <a:gs pos="100000">
               <a:schemeClr val="phClr">
-                <a:lumMod val="99000"/>
-                <a:satMod val="120000"/>
-                <a:shade val="78000"/>
+                <a:tint val="50000"/>
+                <a:shade val="100000"/>
+                <a:satMod val="350000"/>
               </a:schemeClr>
             </a:gs>
           </a:gsLst>
-          <a:lin ang="5400000" scaled="0"/>
+          <a:lin ang="16200000" scaled="0"/>
         </a:gradFill>
       </a:fillStyleLst>
       <a:lnStyleLst>
-        <a:ln w="6350" cap="flat" cmpd="sng" algn="ctr">
+        <a:ln w="9525" cap="flat" cmpd="sng" algn="ctr">
+          <a:solidFill>
+            <a:schemeClr val="phClr">
+              <a:shade val="95000"/>
+              <a:satMod val="105000"/>
+            </a:schemeClr>
+          </a:solidFill>
+          <a:prstDash val="solid"/>
+        </a:ln>
+        <a:ln w="25400" cap="flat" cmpd="sng" algn="ctr">
           <a:solidFill>
             <a:schemeClr val="phClr"/>
           </a:solidFill>
           <a:prstDash val="solid"/>
-          <a:miter lim="800000"/>
         </a:ln>
-        <a:ln w="12700" cap="flat" cmpd="sng" algn="ctr">
+        <a:ln w="38100" cap="flat" cmpd="sng" algn="ctr">
           <a:solidFill>
             <a:schemeClr val="phClr"/>
           </a:solidFill>
           <a:prstDash val="solid"/>
-          <a:miter lim="800000"/>
-        </a:ln>
-        <a:ln w="19050" cap="flat" cmpd="sng" algn="ctr">
-          <a:solidFill>
-            <a:schemeClr val="phClr"/>
-          </a:solidFill>
-          <a:prstDash val="solid"/>
-          <a:miter lim="800000"/>
         </a:ln>
       </a:lnStyleLst>
       <a:effectStyleLst>
         <a:effectStyle>
-          <a:effectLst/>
-        </a:effectStyle>
-        <a:effectStyle>
-          <a:effectLst/>
+          <a:effectLst>
+            <a:outerShdw blurRad="40000" dist="20000" dir="5400000" rotWithShape="0">
+              <a:srgbClr val="000000">
+                <a:alpha val="38000"/>
+              </a:srgbClr>
+            </a:outerShdw>
+          </a:effectLst>
         </a:effectStyle>
         <a:effectStyle>
           <a:effectLst>
-            <a:outerShdw blurRad="57150" dist="19050" dir="5400000" algn="ctr" rotWithShape="0">
+            <a:outerShdw blurRad="40000" dist="23000" dir="5400000" rotWithShape="0">
               <a:srgbClr val="000000">
-                <a:alpha val="63000"/>
+                <a:alpha val="35000"/>
               </a:srgbClr>
             </a:outerShdw>
           </a:effectLst>
+        </a:effectStyle>
+        <a:effectStyle>
+          <a:effectLst>
+            <a:outerShdw blurRad="40000" dist="23000" dir="5400000" rotWithShape="0">
+              <a:srgbClr val="000000">
+                <a:alpha val="35000"/>
+              </a:srgbClr>
+            </a:outerShdw>
+          </a:effectLst>
+          <a:scene3d>
+            <a:camera prst="orthographicFront">
+              <a:rot lat="0" lon="0" rev="0"/>
+            </a:camera>
+            <a:lightRig rig="threePt" dir="t">
+              <a:rot lat="0" lon="0" rev="1200000"/>
+            </a:lightRig>
+          </a:scene3d>
+          <a:sp3d>
+            <a:bevelT w="63500" h="25400"/>
+          </a:sp3d>
         </a:effectStyle>
       </a:effectStyleLst>
       <a:bgFillStyleLst>
         <a:solidFill>
           <a:schemeClr val="phClr"/>
         </a:solidFill>
-        <a:solidFill>
-          <a:schemeClr val="phClr">
-            <a:tint val="95000"/>
-            <a:satMod val="170000"/>
-          </a:schemeClr>
-        </a:solidFill>
         <a:gradFill rotWithShape="1">
           <a:gsLst>
             <a:gs pos="0">
               <a:schemeClr val="phClr">
-                <a:tint val="93000"/>
-                <a:satMod val="150000"/>
-                <a:shade val="98000"/>
-                <a:lumMod val="102000"/>
+                <a:tint val="40000"/>
+                <a:satMod val="350000"/>
               </a:schemeClr>
             </a:gs>
-            <a:gs pos="50000">
+            <a:gs pos="40000">
               <a:schemeClr val="phClr">
-                <a:tint val="98000"/>
-                <a:satMod val="130000"/>
-                <a:shade val="90000"/>
-                <a:lumMod val="103000"/>
+                <a:tint val="45000"/>
+                <a:shade val="99000"/>
+                <a:satMod val="350000"/>
               </a:schemeClr>
             </a:gs>
             <a:gs pos="100000">
               <a:schemeClr val="phClr">
-                <a:shade val="63000"/>
-                <a:satMod val="120000"/>
+                <a:shade val="20000"/>
+                <a:satMod val="255000"/>
               </a:schemeClr>
             </a:gs>
           </a:gsLst>
-          <a:lin ang="5400000" scaled="0"/>
+          <a:path path="circle">
+            <a:fillToRect l="50000" t="-80000" r="50000" b="180000"/>
+          </a:path>
+        </a:gradFill>
+        <a:gradFill rotWithShape="1">
+          <a:gsLst>
+            <a:gs pos="0">
+              <a:schemeClr val="phClr">
+                <a:tint val="80000"/>
+                <a:satMod val="300000"/>
+              </a:schemeClr>
+            </a:gs>
+            <a:gs pos="100000">
+              <a:schemeClr val="phClr">
+                <a:shade val="30000"/>
+                <a:satMod val="200000"/>
+              </a:schemeClr>
+            </a:gs>
+          </a:gsLst>
+          <a:path path="circle">
+            <a:fillToRect l="50000" t="50000" r="50000" b="50000"/>
+          </a:path>
         </a:gradFill>
       </a:bgFillStyleLst>
     </a:fmtScheme>
   </a:themeElements>
-  <a:objectDefaults/>
+  <a:objectDefaults>
+    <a:spDef>
+      <a:spPr/>
+      <a:bodyPr/>
+      <a:lstStyle/>
+      <a:style>
+        <a:lnRef idx="1">
+          <a:schemeClr val="accent1"/>
+        </a:lnRef>
+        <a:fillRef idx="3">
+          <a:schemeClr val="accent1"/>
+        </a:fillRef>
+        <a:effectRef idx="2">
+          <a:schemeClr val="accent1"/>
+        </a:effectRef>
+        <a:fontRef idx="minor">
+          <a:schemeClr val="lt1"/>
+        </a:fontRef>
+      </a:style>
+    </a:spDef>
+    <a:lnDef>
+      <a:spPr/>
+      <a:bodyPr/>
+      <a:lstStyle/>
+      <a:style>
+        <a:lnRef idx="2">
+          <a:schemeClr val="accent1"/>
+        </a:lnRef>
+        <a:fillRef idx="0">
+          <a:schemeClr val="accent1"/>
+        </a:fillRef>
+        <a:effectRef idx="1">
+          <a:schemeClr val="accent1"/>
+        </a:effectRef>
+        <a:fontRef idx="minor">
+          <a:schemeClr val="tx1"/>
+        </a:fontRef>
+      </a:style>
+    </a:lnDef>
+  </a:objectDefaults>
   <a:extraClrSchemeLst/>
-  <a:extLst>
-    <a:ext uri="{05A4C25C-085E-4340-85A3-A5531E510DB2}">
-      <thm15:themeFamily xmlns:thm15="http://schemas.microsoft.com/office/thememl/2012/main" name="Office Theme" id="{2E142A2C-CD16-42D6-873A-C26D2A0506FA}" vid="{1BDDFF52-6CD6-40A5-AB3C-68EB2F1E4D0A}"/>
-    </a:ext>
-  </a:extLst>
 </a:theme>
 </file>
</xml_diff>